<commit_message>
publish Wi-Fi Display program
</commit_message>
<xml_diff>
--- a/Beer Keg Monitor.docx
+++ b/Beer Keg Monitor.docx
@@ -4,101 +4,35 @@
   <w:body>
     <w:p>
       <w:pPr>
-        <w:pStyle w:val="NormalWeb"/>
-      </w:pPr>
-      <w:proofErr w:type="spellStart"/>
-      <w:r>
-        <w:t>DHTSimple</w:t>
-      </w:r>
-      <w:proofErr w:type="spellEnd"/>
-      <w:r>
-        <w:t xml:space="preserve"> Library</w:t>
+        <w:pStyle w:val="Heading1"/>
+      </w:pPr>
+      <w:r>
+        <w:t xml:space="preserve">Beer </w:t>
+      </w:r>
+      <w:r>
+        <w:t>Keg Monitoring System</w:t>
+      </w:r>
+    </w:p>
+    <w:p>
+      <w:r>
+        <w:t>Build your own beer keg monitoring system that keeps track of how many glasses</w:t>
+      </w:r>
+      <w:r>
+        <w:t xml:space="preserve"> of beer </w:t>
+      </w:r>
+      <w:r>
+        <w:t xml:space="preserve">are left in each keg.  The entire system </w:t>
+      </w:r>
+      <w:r>
+        <w:t>costs</w:t>
+      </w:r>
+      <w:r>
+        <w:t xml:space="preserve"> less than $100 for 5 beer taps.</w:t>
       </w:r>
     </w:p>
     <w:p>
       <w:pPr>
         <w:pStyle w:val="Heading2"/>
-      </w:pPr>
-      <w:r>
-        <w:t>Overview</w:t>
-      </w:r>
-    </w:p>
-    <w:p>
-      <w:pPr>
-        <w:pStyle w:val="NormalWeb"/>
-      </w:pPr>
-      <w:r>
-        <w:t xml:space="preserve">I wrote this library because I could not find a DHT library that worked on all my applications. They either were not reliable, </w:t>
-      </w:r>
-      <w:proofErr w:type="spellStart"/>
-      <w:r>
-        <w:t>interferred</w:t>
-      </w:r>
-      <w:proofErr w:type="spellEnd"/>
-      <w:r>
-        <w:t xml:space="preserve"> with another library or caused my VGA monitor to blink ever time the sensor was read. The library uses only Arduino functions and is very easy to use and understand.</w:t>
-      </w:r>
-    </w:p>
-    <w:p>
-      <w:pPr>
-        <w:pStyle w:val="Heading2"/>
-      </w:pPr>
-      <w:r>
-        <w:t>Features</w:t>
-      </w:r>
-    </w:p>
-    <w:p>
-      <w:pPr>
-        <w:pStyle w:val="NormalWeb"/>
-      </w:pPr>
-      <w:r>
-        <w:t xml:space="preserve">This library works with all known DHT sensors and should work with almost all </w:t>
-      </w:r>
-      <w:proofErr w:type="spellStart"/>
-      <w:r>
-        <w:t>Arduion</w:t>
-      </w:r>
-      <w:proofErr w:type="spellEnd"/>
-      <w:r>
-        <w:t xml:space="preserve"> boards. I tested it with UNO, Mega, ESP32 WROOM Dev Board, ESP32 D1 R32 and ESP8266 D1 R2 boards.</w:t>
-      </w:r>
-    </w:p>
-    <w:p>
-      <w:pPr>
-        <w:pStyle w:val="Heading1"/>
-      </w:pPr>
-    </w:p>
-    <w:p>
-      <w:pPr>
-        <w:pStyle w:val="Heading1"/>
-      </w:pPr>
-      <w:r>
-        <w:t xml:space="preserve">Beer </w:t>
-      </w:r>
-      <w:r>
-        <w:t>Keg Monitoring System</w:t>
-      </w:r>
-    </w:p>
-    <w:p>
-      <w:r>
-        <w:t>Build your own beer keg monitoring system that keeps track of how many glasses</w:t>
-      </w:r>
-      <w:r>
-        <w:t xml:space="preserve"> of beer </w:t>
-      </w:r>
-      <w:r>
-        <w:t xml:space="preserve">are left in each keg.  The entire system </w:t>
-      </w:r>
-      <w:r>
-        <w:t>costs</w:t>
-      </w:r>
-      <w:r>
-        <w:t xml:space="preserve"> less than $100 for 5 beer taps.</w:t>
-      </w:r>
-    </w:p>
-    <w:p>
-      <w:pPr>
-        <w:pStyle w:val="Heading2"/>
         <w:rPr>
           <w:rFonts w:eastAsia="Times New Roman"/>
         </w:rPr>
@@ -106,1162 +40,15 @@
       <w:r>
         <w:rPr>
           <w:rFonts w:eastAsia="Times New Roman"/>
-        </w:rPr>
-        <w:t>Features:</w:t>
-      </w:r>
-    </w:p>
-    <w:p>
-      <w:pPr>
-        <w:pStyle w:val="ListParagraph"/>
-        <w:numPr>
-          <w:ilvl w:val="0"/>
-          <w:numId w:val="6"/>
-        </w:numPr>
-      </w:pPr>
-      <w:r>
-        <w:t xml:space="preserve">Tracks </w:t>
-      </w:r>
-      <w:r>
-        <w:t xml:space="preserve">number of glasses </w:t>
-      </w:r>
-      <w:r>
-        <w:t>of beer left</w:t>
-      </w:r>
-      <w:r>
-        <w:t>.</w:t>
-      </w:r>
-    </w:p>
-    <w:p>
-      <w:pPr>
-        <w:pStyle w:val="ListParagraph"/>
-        <w:numPr>
-          <w:ilvl w:val="0"/>
-          <w:numId w:val="6"/>
-        </w:numPr>
-      </w:pPr>
-      <w:r>
-        <w:t>Controls Beer freezer temperature</w:t>
-      </w:r>
-    </w:p>
-    <w:p>
-      <w:pPr>
-        <w:pStyle w:val="ListParagraph"/>
-        <w:numPr>
-          <w:ilvl w:val="0"/>
-          <w:numId w:val="6"/>
-        </w:numPr>
-      </w:pPr>
-      <w:r>
-        <w:t xml:space="preserve">Provides email and text message </w:t>
-      </w:r>
-      <w:r>
-        <w:t>notification</w:t>
-      </w:r>
-      <w:r>
-        <w:t>s.</w:t>
-      </w:r>
-    </w:p>
-    <w:p>
-      <w:pPr>
-        <w:pStyle w:val="ListParagraph"/>
-        <w:numPr>
-          <w:ilvl w:val="0"/>
-          <w:numId w:val="6"/>
-        </w:numPr>
-      </w:pPr>
-      <w:r>
-        <w:t>Provides local and remote displays</w:t>
-      </w:r>
-      <w:r>
-        <w:t xml:space="preserve"> via Wi-Fi</w:t>
-      </w:r>
-      <w:r>
-        <w:t>.</w:t>
-      </w:r>
-    </w:p>
-    <w:p>
-      <w:pPr>
-        <w:pStyle w:val="ListParagraph"/>
-        <w:numPr>
-          <w:ilvl w:val="1"/>
-          <w:numId w:val="6"/>
-        </w:numPr>
-        <w:rPr>
-          <w:rFonts w:cs="Arial"/>
-          <w:color w:val="0F1111"/>
-          <w:sz w:val="21"/>
-          <w:szCs w:val="21"/>
-        </w:rPr>
-      </w:pPr>
-      <w:r>
-        <w:t>Accessible anywhere in the world with Port Forwarding</w:t>
-      </w:r>
-    </w:p>
-    <w:p>
-      <w:pPr>
-        <w:pStyle w:val="ListParagraph"/>
-        <w:numPr>
-          <w:ilvl w:val="0"/>
-          <w:numId w:val="6"/>
-        </w:numPr>
-      </w:pPr>
-      <w:r>
-        <w:t xml:space="preserve">Monitors up to </w:t>
-      </w:r>
-      <w:r>
-        <w:t>8</w:t>
-      </w:r>
-      <w:r>
-        <w:t xml:space="preserve"> beer taps.</w:t>
-      </w:r>
-    </w:p>
-    <w:p>
-      <w:pPr>
-        <w:pStyle w:val="ListParagraph"/>
-        <w:numPr>
-          <w:ilvl w:val="0"/>
-          <w:numId w:val="6"/>
-        </w:numPr>
-      </w:pPr>
-      <w:r>
-        <w:t>Temperature Stability +/- 0.75 degrees F</w:t>
-      </w:r>
-    </w:p>
-    <w:p>
-      <w:pPr>
-        <w:pStyle w:val="ListParagraph"/>
-        <w:numPr>
-          <w:ilvl w:val="0"/>
-          <w:numId w:val="6"/>
-        </w:numPr>
-      </w:pPr>
-      <w:r>
-        <w:t>Works with all DHT and/or MCP9808 Temperature Sensors</w:t>
-      </w:r>
-    </w:p>
-    <w:p>
-      <w:pPr>
-        <w:pStyle w:val="ListParagraph"/>
-        <w:numPr>
-          <w:ilvl w:val="1"/>
-          <w:numId w:val="6"/>
-        </w:numPr>
-      </w:pPr>
-      <w:r>
-        <w:t>Up</w:t>
-      </w:r>
-      <w:r>
-        <w:t xml:space="preserve"> </w:t>
-      </w:r>
-      <w:r>
-        <w:t xml:space="preserve">to 3 </w:t>
-      </w:r>
-      <w:r>
-        <w:t xml:space="preserve">temperature </w:t>
-      </w:r>
-      <w:r>
-        <w:t xml:space="preserve">sensors can be </w:t>
-      </w:r>
-      <w:r>
-        <w:t>used.</w:t>
-      </w:r>
-    </w:p>
-    <w:p>
-      <w:pPr>
-        <w:pStyle w:val="Heading2"/>
-        <w:rPr>
-          <w:rFonts w:eastAsia="Times New Roman"/>
-        </w:rPr>
-      </w:pPr>
-      <w:r>
-        <w:rPr>
-          <w:rFonts w:eastAsia="Times New Roman"/>
-        </w:rPr>
-        <w:t>Introduction</w:t>
-      </w:r>
-    </w:p>
-    <w:p>
-      <w:r>
-        <w:t>Currently there are two types of systems to measure how much beer is left in the keg:</w:t>
-      </w:r>
-    </w:p>
-    <w:p>
-      <w:pPr>
-        <w:pStyle w:val="ListParagraph"/>
-        <w:numPr>
-          <w:ilvl w:val="0"/>
-          <w:numId w:val="2"/>
-        </w:numPr>
-      </w:pPr>
-      <w:r>
-        <w:t>Flow measuring.</w:t>
-      </w:r>
-    </w:p>
-    <w:p>
-      <w:pPr>
-        <w:pStyle w:val="ListParagraph"/>
-        <w:numPr>
-          <w:ilvl w:val="0"/>
-          <w:numId w:val="2"/>
-        </w:numPr>
-      </w:pPr>
-      <w:r>
-        <w:t>Weight of Keg.</w:t>
-      </w:r>
-    </w:p>
-    <w:p>
-      <w:r>
-        <w:t>Flow measuring systems are cheaper (6 taps about $500) but they have limited utility and you have to clean them every time you clean your beer lines (every 6 weeks).</w:t>
-      </w:r>
-    </w:p>
-    <w:p>
-      <w:r>
-        <w:t>Weight of keg systems are none intrusive, but very expensive ($1000 for 5 taps).  They are not integrated with your entire system.</w:t>
-      </w:r>
-      <w:r>
-        <w:t xml:space="preserve">  This system </w:t>
-      </w:r>
-      <w:r>
-        <w:t>measures the weight of the keg but is low cost.</w:t>
-      </w:r>
-    </w:p>
-    <w:p>
-      <w:pPr>
-        <w:pStyle w:val="Heading2"/>
-      </w:pPr>
-      <w:r>
-        <w:lastRenderedPageBreak/>
-        <w:t>Bill of Materials</w:t>
-      </w:r>
-    </w:p>
-    <w:p>
-      <w:r>
-        <w:t>The following is the bill of Materials for the entire system:</w:t>
-      </w:r>
-    </w:p>
-    <w:tbl>
-      <w:tblPr>
-        <w:tblStyle w:val="TableGrid"/>
-        <w:tblW w:w="0" w:type="auto"/>
-        <w:tblLook w:val="04A0" w:firstRow="1" w:lastRow="0" w:firstColumn="1" w:lastColumn="0" w:noHBand="0" w:noVBand="1"/>
-      </w:tblPr>
-      <w:tblGrid>
-        <w:gridCol w:w="805"/>
-        <w:gridCol w:w="900"/>
-        <w:gridCol w:w="3905"/>
-        <w:gridCol w:w="1315"/>
-        <w:gridCol w:w="1440"/>
-      </w:tblGrid>
-      <w:tr>
-        <w:trPr>
-          <w:cantSplit/>
-          <w:trHeight w:val="300"/>
-        </w:trPr>
-        <w:tc>
-          <w:tcPr>
-            <w:tcW w:w="805" w:type="dxa"/>
-            <w:noWrap/>
-            <w:hideMark/>
-          </w:tcPr>
-          <w:p>
-            <w:r>
-              <w:t>Item</w:t>
-            </w:r>
-          </w:p>
-        </w:tc>
-        <w:tc>
-          <w:tcPr>
-            <w:tcW w:w="900" w:type="dxa"/>
-            <w:noWrap/>
-            <w:hideMark/>
-          </w:tcPr>
-          <w:p>
-            <w:r>
-              <w:t>Qty</w:t>
-            </w:r>
-          </w:p>
-        </w:tc>
-        <w:tc>
-          <w:tcPr>
-            <w:tcW w:w="3905" w:type="dxa"/>
-            <w:noWrap/>
-            <w:hideMark/>
-          </w:tcPr>
-          <w:p>
-            <w:r>
-              <w:t>Description</w:t>
-            </w:r>
-          </w:p>
-        </w:tc>
-        <w:tc>
-          <w:tcPr>
-            <w:tcW w:w="1315" w:type="dxa"/>
-            <w:noWrap/>
-            <w:hideMark/>
-          </w:tcPr>
-          <w:p>
-            <w:r>
-              <w:t>Price</w:t>
-            </w:r>
-          </w:p>
-        </w:tc>
-        <w:tc>
-          <w:tcPr>
-            <w:tcW w:w="1440" w:type="dxa"/>
-            <w:noWrap/>
-            <w:hideMark/>
-          </w:tcPr>
-          <w:p>
-            <w:r>
-              <w:t>Total</w:t>
-            </w:r>
-          </w:p>
-        </w:tc>
-      </w:tr>
-      <w:tr>
-        <w:trPr>
-          <w:cantSplit/>
-          <w:trHeight w:val="300"/>
-        </w:trPr>
-        <w:tc>
-          <w:tcPr>
-            <w:tcW w:w="805" w:type="dxa"/>
-            <w:noWrap/>
-            <w:hideMark/>
-          </w:tcPr>
-          <w:p>
-            <w:r>
-              <w:t>1</w:t>
-            </w:r>
-          </w:p>
-        </w:tc>
-        <w:tc>
-          <w:tcPr>
-            <w:tcW w:w="900" w:type="dxa"/>
-            <w:noWrap/>
-            <w:hideMark/>
-          </w:tcPr>
-          <w:p>
-            <w:r>
-              <w:t>5</w:t>
-            </w:r>
-          </w:p>
-        </w:tc>
-        <w:tc>
-          <w:tcPr>
-            <w:tcW w:w="3905" w:type="dxa"/>
-            <w:noWrap/>
-            <w:hideMark/>
-          </w:tcPr>
-          <w:p>
-            <w:r>
-              <w:t>Scale Plate</w:t>
-            </w:r>
-          </w:p>
-        </w:tc>
-        <w:tc>
-          <w:tcPr>
-            <w:tcW w:w="1315" w:type="dxa"/>
-            <w:noWrap/>
-            <w:hideMark/>
-          </w:tcPr>
-          <w:p>
-            <w:r>
-              <w:t xml:space="preserve"> $       2.50 </w:t>
-            </w:r>
-          </w:p>
-        </w:tc>
-        <w:tc>
-          <w:tcPr>
-            <w:tcW w:w="1440" w:type="dxa"/>
-            <w:noWrap/>
-            <w:hideMark/>
-          </w:tcPr>
-          <w:p>
-            <w:r>
-              <w:t xml:space="preserve"> $    12.50 </w:t>
-            </w:r>
-          </w:p>
-        </w:tc>
-      </w:tr>
-      <w:tr>
-        <w:trPr>
-          <w:cantSplit/>
-          <w:trHeight w:val="300"/>
-        </w:trPr>
-        <w:tc>
-          <w:tcPr>
-            <w:tcW w:w="805" w:type="dxa"/>
-            <w:noWrap/>
-            <w:hideMark/>
-          </w:tcPr>
-          <w:p>
-            <w:r>
-              <w:t>2</w:t>
-            </w:r>
-          </w:p>
-        </w:tc>
-        <w:tc>
-          <w:tcPr>
-            <w:tcW w:w="900" w:type="dxa"/>
-            <w:noWrap/>
-            <w:hideMark/>
-          </w:tcPr>
-          <w:p>
-            <w:r>
-              <w:t>5</w:t>
-            </w:r>
-          </w:p>
-        </w:tc>
-        <w:tc>
-          <w:tcPr>
-            <w:tcW w:w="3905" w:type="dxa"/>
-            <w:noWrap/>
-            <w:hideMark/>
-          </w:tcPr>
-          <w:p>
-            <w:r>
-              <w:t>HX711 Load Cell Amplifier</w:t>
-            </w:r>
-          </w:p>
-        </w:tc>
-        <w:tc>
-          <w:tcPr>
-            <w:tcW w:w="1315" w:type="dxa"/>
-            <w:noWrap/>
-            <w:hideMark/>
-          </w:tcPr>
-          <w:p>
-            <w:r>
-              <w:t xml:space="preserve"> $       2.00 </w:t>
-            </w:r>
-          </w:p>
-        </w:tc>
-        <w:tc>
-          <w:tcPr>
-            <w:tcW w:w="1440" w:type="dxa"/>
-            <w:noWrap/>
-            <w:hideMark/>
-          </w:tcPr>
-          <w:p>
-            <w:r>
-              <w:t xml:space="preserve"> $    10.00 </w:t>
-            </w:r>
-          </w:p>
-        </w:tc>
-      </w:tr>
-      <w:tr>
-        <w:trPr>
-          <w:cantSplit/>
-          <w:trHeight w:val="300"/>
-        </w:trPr>
-        <w:tc>
-          <w:tcPr>
-            <w:tcW w:w="805" w:type="dxa"/>
-            <w:noWrap/>
-            <w:hideMark/>
-          </w:tcPr>
-          <w:p>
-            <w:r>
-              <w:t>3</w:t>
-            </w:r>
-          </w:p>
-        </w:tc>
-        <w:tc>
-          <w:tcPr>
-            <w:tcW w:w="900" w:type="dxa"/>
-            <w:noWrap/>
-            <w:hideMark/>
-          </w:tcPr>
-          <w:p>
-            <w:r>
-              <w:t>20</w:t>
-            </w:r>
-          </w:p>
-        </w:tc>
-        <w:tc>
-          <w:tcPr>
-            <w:tcW w:w="3905" w:type="dxa"/>
-            <w:noWrap/>
-            <w:hideMark/>
-          </w:tcPr>
-          <w:p>
-            <w:r>
-              <w:t>Load Cell</w:t>
-            </w:r>
-          </w:p>
-        </w:tc>
-        <w:tc>
-          <w:tcPr>
-            <w:tcW w:w="1315" w:type="dxa"/>
-            <w:noWrap/>
-            <w:hideMark/>
-          </w:tcPr>
-          <w:p>
-            <w:r>
-              <w:t xml:space="preserve"> $       0.80 </w:t>
-            </w:r>
-          </w:p>
-        </w:tc>
-        <w:tc>
-          <w:tcPr>
-            <w:tcW w:w="1440" w:type="dxa"/>
-            <w:noWrap/>
-            <w:hideMark/>
-          </w:tcPr>
-          <w:p>
-            <w:r>
-              <w:t xml:space="preserve"> $    16.00 </w:t>
-            </w:r>
-          </w:p>
-        </w:tc>
-      </w:tr>
-      <w:tr>
-        <w:trPr>
-          <w:cantSplit/>
-          <w:trHeight w:val="300"/>
-        </w:trPr>
-        <w:tc>
-          <w:tcPr>
-            <w:tcW w:w="805" w:type="dxa"/>
-            <w:noWrap/>
-            <w:hideMark/>
-          </w:tcPr>
-          <w:p>
-            <w:r>
-              <w:t>4</w:t>
-            </w:r>
-          </w:p>
-        </w:tc>
-        <w:tc>
-          <w:tcPr>
-            <w:tcW w:w="900" w:type="dxa"/>
-            <w:noWrap/>
-            <w:hideMark/>
-          </w:tcPr>
-          <w:p>
-            <w:r>
-              <w:t>1</w:t>
-            </w:r>
-          </w:p>
-        </w:tc>
-        <w:tc>
-          <w:tcPr>
-            <w:tcW w:w="3905" w:type="dxa"/>
-            <w:noWrap/>
-            <w:hideMark/>
-          </w:tcPr>
-          <w:p>
-            <w:r>
-              <w:t>PS2 Keyboard</w:t>
-            </w:r>
-          </w:p>
-        </w:tc>
-        <w:tc>
-          <w:tcPr>
-            <w:tcW w:w="1315" w:type="dxa"/>
-            <w:noWrap/>
-            <w:hideMark/>
-          </w:tcPr>
-          <w:p>
-            <w:r>
-              <w:t xml:space="preserve"> $       5.00 </w:t>
-            </w:r>
-          </w:p>
-        </w:tc>
-        <w:tc>
-          <w:tcPr>
-            <w:tcW w:w="1440" w:type="dxa"/>
-            <w:noWrap/>
-            <w:hideMark/>
-          </w:tcPr>
-          <w:p>
-            <w:r>
-              <w:t xml:space="preserve"> $       5.00 </w:t>
-            </w:r>
-          </w:p>
-        </w:tc>
-      </w:tr>
-      <w:tr>
-        <w:trPr>
-          <w:cantSplit/>
-          <w:trHeight w:val="300"/>
-        </w:trPr>
-        <w:tc>
-          <w:tcPr>
-            <w:tcW w:w="805" w:type="dxa"/>
-            <w:noWrap/>
-            <w:hideMark/>
-          </w:tcPr>
-          <w:p>
-            <w:r>
-              <w:t>5</w:t>
-            </w:r>
-          </w:p>
-        </w:tc>
-        <w:tc>
-          <w:tcPr>
-            <w:tcW w:w="900" w:type="dxa"/>
-            <w:noWrap/>
-            <w:hideMark/>
-          </w:tcPr>
-          <w:p>
-            <w:r>
-              <w:t>1</w:t>
-            </w:r>
-          </w:p>
-        </w:tc>
-        <w:tc>
-          <w:tcPr>
-            <w:tcW w:w="3905" w:type="dxa"/>
-            <w:noWrap/>
-            <w:hideMark/>
-          </w:tcPr>
-          <w:p>
-            <w:r>
-              <w:t>VGA Monitor</w:t>
-            </w:r>
-          </w:p>
-        </w:tc>
-        <w:tc>
-          <w:tcPr>
-            <w:tcW w:w="1315" w:type="dxa"/>
-            <w:noWrap/>
-            <w:hideMark/>
-          </w:tcPr>
-          <w:p>
-            <w:r>
-              <w:t xml:space="preserve"> $    10.00 </w:t>
-            </w:r>
-          </w:p>
-        </w:tc>
-        <w:tc>
-          <w:tcPr>
-            <w:tcW w:w="1440" w:type="dxa"/>
-            <w:noWrap/>
-            <w:hideMark/>
-          </w:tcPr>
-          <w:p>
-            <w:r>
-              <w:t xml:space="preserve"> $    10.00 </w:t>
-            </w:r>
-          </w:p>
-        </w:tc>
-      </w:tr>
-      <w:tr>
-        <w:trPr>
-          <w:cantSplit/>
-          <w:trHeight w:val="300"/>
-        </w:trPr>
-        <w:tc>
-          <w:tcPr>
-            <w:tcW w:w="805" w:type="dxa"/>
-            <w:noWrap/>
-            <w:hideMark/>
-          </w:tcPr>
-          <w:p>
-            <w:r>
-              <w:t>6</w:t>
-            </w:r>
-          </w:p>
-        </w:tc>
-        <w:tc>
-          <w:tcPr>
-            <w:tcW w:w="900" w:type="dxa"/>
-            <w:noWrap/>
-            <w:hideMark/>
-          </w:tcPr>
-          <w:p>
-            <w:r>
-              <w:t>2</w:t>
-            </w:r>
-          </w:p>
-        </w:tc>
-        <w:tc>
-          <w:tcPr>
-            <w:tcW w:w="3905" w:type="dxa"/>
-            <w:noWrap/>
-            <w:hideMark/>
-          </w:tcPr>
-          <w:p>
-            <w:r>
-              <w:t>DHT 22/AM2302 Sensor</w:t>
-            </w:r>
-          </w:p>
-        </w:tc>
-        <w:tc>
-          <w:tcPr>
-            <w:tcW w:w="1315" w:type="dxa"/>
-            <w:noWrap/>
-            <w:hideMark/>
-          </w:tcPr>
-          <w:p>
-            <w:r>
-              <w:t xml:space="preserve"> $       3.33 </w:t>
-            </w:r>
-          </w:p>
-        </w:tc>
-        <w:tc>
-          <w:tcPr>
-            <w:tcW w:w="1440" w:type="dxa"/>
-            <w:noWrap/>
-            <w:hideMark/>
-          </w:tcPr>
-          <w:p>
-            <w:r>
-              <w:t xml:space="preserve"> $       6.67 </w:t>
-            </w:r>
-          </w:p>
-        </w:tc>
-      </w:tr>
-      <w:tr>
-        <w:trPr>
-          <w:cantSplit/>
-          <w:trHeight w:val="300"/>
-        </w:trPr>
-        <w:tc>
-          <w:tcPr>
-            <w:tcW w:w="805" w:type="dxa"/>
-            <w:noWrap/>
-            <w:hideMark/>
-          </w:tcPr>
-          <w:p>
-            <w:r>
-              <w:t>7</w:t>
-            </w:r>
-          </w:p>
-        </w:tc>
-        <w:tc>
-          <w:tcPr>
-            <w:tcW w:w="900" w:type="dxa"/>
-            <w:noWrap/>
-            <w:hideMark/>
-          </w:tcPr>
-          <w:p>
-            <w:r>
-              <w:t>1</w:t>
-            </w:r>
-          </w:p>
-        </w:tc>
-        <w:tc>
-          <w:tcPr>
-            <w:tcW w:w="3905" w:type="dxa"/>
-            <w:noWrap/>
-            <w:hideMark/>
-          </w:tcPr>
-          <w:p>
-            <w:r>
-              <w:t>ESP32 Breakout Board</w:t>
-            </w:r>
-          </w:p>
-        </w:tc>
-        <w:tc>
-          <w:tcPr>
-            <w:tcW w:w="1315" w:type="dxa"/>
-            <w:noWrap/>
-            <w:hideMark/>
-          </w:tcPr>
-          <w:p>
-            <w:r>
-              <w:t xml:space="preserve"> $    13.00 </w:t>
-            </w:r>
-          </w:p>
-        </w:tc>
-        <w:tc>
-          <w:tcPr>
-            <w:tcW w:w="1440" w:type="dxa"/>
-            <w:noWrap/>
-            <w:hideMark/>
-          </w:tcPr>
-          <w:p>
-            <w:r>
-              <w:t xml:space="preserve"> $    13.00 </w:t>
-            </w:r>
-          </w:p>
-        </w:tc>
-      </w:tr>
-      <w:tr>
-        <w:trPr>
-          <w:cantSplit/>
-          <w:trHeight w:val="300"/>
-        </w:trPr>
-        <w:tc>
-          <w:tcPr>
-            <w:tcW w:w="805" w:type="dxa"/>
-            <w:noWrap/>
-            <w:hideMark/>
-          </w:tcPr>
-          <w:p>
-            <w:r>
-              <w:t>8</w:t>
-            </w:r>
-          </w:p>
-        </w:tc>
-        <w:tc>
-          <w:tcPr>
-            <w:tcW w:w="900" w:type="dxa"/>
-            <w:noWrap/>
-            <w:hideMark/>
-          </w:tcPr>
-          <w:p>
-            <w:r>
-              <w:t>1</w:t>
-            </w:r>
-          </w:p>
-        </w:tc>
-        <w:tc>
-          <w:tcPr>
-            <w:tcW w:w="3905" w:type="dxa"/>
-            <w:noWrap/>
-            <w:hideMark/>
-          </w:tcPr>
-          <w:p>
-            <w:r>
-              <w:t>ESP32 Development Board</w:t>
-            </w:r>
-          </w:p>
-        </w:tc>
-        <w:tc>
-          <w:tcPr>
-            <w:tcW w:w="1315" w:type="dxa"/>
-            <w:noWrap/>
-            <w:hideMark/>
-          </w:tcPr>
-          <w:p>
-            <w:r>
-              <w:t xml:space="preserve"> $       8.50 </w:t>
-            </w:r>
-          </w:p>
-        </w:tc>
-        <w:tc>
-          <w:tcPr>
-            <w:tcW w:w="1440" w:type="dxa"/>
-            <w:noWrap/>
-            <w:hideMark/>
-          </w:tcPr>
-          <w:p>
-            <w:r>
-              <w:t xml:space="preserve"> $       8.50 </w:t>
-            </w:r>
-          </w:p>
-        </w:tc>
-      </w:tr>
-      <w:tr>
-        <w:trPr>
-          <w:cantSplit/>
-          <w:trHeight w:val="300"/>
-        </w:trPr>
-        <w:tc>
-          <w:tcPr>
-            <w:tcW w:w="805" w:type="dxa"/>
-            <w:noWrap/>
-            <w:hideMark/>
-          </w:tcPr>
-          <w:p>
-            <w:r>
-              <w:t>9</w:t>
-            </w:r>
-          </w:p>
-        </w:tc>
-        <w:tc>
-          <w:tcPr>
-            <w:tcW w:w="900" w:type="dxa"/>
-            <w:noWrap/>
-            <w:hideMark/>
-          </w:tcPr>
-          <w:p>
-            <w:r>
-              <w:t>1</w:t>
-            </w:r>
-          </w:p>
-        </w:tc>
-        <w:tc>
-          <w:tcPr>
-            <w:tcW w:w="3905" w:type="dxa"/>
-            <w:noWrap/>
-            <w:hideMark/>
-          </w:tcPr>
-          <w:p>
-            <w:r>
-              <w:t>VGA Brea</w:t>
-            </w:r>
-            <w:r>
-              <w:t>k</w:t>
-            </w:r>
-            <w:r>
-              <w:t>out Board</w:t>
-            </w:r>
-          </w:p>
-        </w:tc>
-        <w:tc>
-          <w:tcPr>
-            <w:tcW w:w="1315" w:type="dxa"/>
-            <w:noWrap/>
-            <w:hideMark/>
-          </w:tcPr>
-          <w:p>
-            <w:r>
-              <w:t xml:space="preserve"> $       7.50 </w:t>
-            </w:r>
-          </w:p>
-        </w:tc>
-        <w:tc>
-          <w:tcPr>
-            <w:tcW w:w="1440" w:type="dxa"/>
-            <w:noWrap/>
-            <w:hideMark/>
-          </w:tcPr>
-          <w:p>
-            <w:r>
-              <w:t xml:space="preserve"> $       7.50 </w:t>
-            </w:r>
-          </w:p>
-        </w:tc>
-      </w:tr>
-      <w:tr>
-        <w:trPr>
-          <w:cantSplit/>
-          <w:trHeight w:val="300"/>
-        </w:trPr>
-        <w:tc>
-          <w:tcPr>
-            <w:tcW w:w="805" w:type="dxa"/>
-            <w:noWrap/>
-            <w:hideMark/>
-          </w:tcPr>
-          <w:p>
-            <w:r>
-              <w:t>10</w:t>
-            </w:r>
-          </w:p>
-        </w:tc>
-        <w:tc>
-          <w:tcPr>
-            <w:tcW w:w="900" w:type="dxa"/>
-            <w:noWrap/>
-            <w:hideMark/>
-          </w:tcPr>
-          <w:p>
-            <w:r>
-              <w:t>1</w:t>
-            </w:r>
-          </w:p>
-        </w:tc>
-        <w:tc>
-          <w:tcPr>
-            <w:tcW w:w="3905" w:type="dxa"/>
-            <w:noWrap/>
-            <w:hideMark/>
-          </w:tcPr>
-          <w:p>
-            <w:r>
-              <w:t>PS2 Breakout Board</w:t>
-            </w:r>
-          </w:p>
-        </w:tc>
-        <w:tc>
-          <w:tcPr>
-            <w:tcW w:w="1315" w:type="dxa"/>
-            <w:noWrap/>
-            <w:hideMark/>
-          </w:tcPr>
-          <w:p>
-            <w:r>
-              <w:t xml:space="preserve"> $       4.00 </w:t>
-            </w:r>
-          </w:p>
-        </w:tc>
-        <w:tc>
-          <w:tcPr>
-            <w:tcW w:w="1440" w:type="dxa"/>
-            <w:noWrap/>
-            <w:hideMark/>
-          </w:tcPr>
-          <w:p>
-            <w:r>
-              <w:t xml:space="preserve"> $       4.00 </w:t>
-            </w:r>
-          </w:p>
-        </w:tc>
-      </w:tr>
-      <w:tr>
-        <w:trPr>
-          <w:cantSplit/>
-          <w:trHeight w:val="300"/>
-        </w:trPr>
-        <w:tc>
-          <w:tcPr>
-            <w:tcW w:w="805" w:type="dxa"/>
-            <w:noWrap/>
-          </w:tcPr>
-          <w:p>
-            <w:r>
-              <w:t>11</w:t>
-            </w:r>
-          </w:p>
-        </w:tc>
-        <w:tc>
-          <w:tcPr>
-            <w:tcW w:w="900" w:type="dxa"/>
-            <w:noWrap/>
-          </w:tcPr>
-          <w:p>
-            <w:r>
-              <w:t>1</w:t>
-            </w:r>
-          </w:p>
-        </w:tc>
-        <w:tc>
-          <w:tcPr>
-            <w:tcW w:w="3905" w:type="dxa"/>
-            <w:noWrap/>
-          </w:tcPr>
-          <w:p>
-            <w:r>
-              <w:t>Relay</w:t>
-            </w:r>
-          </w:p>
-        </w:tc>
-        <w:tc>
-          <w:tcPr>
-            <w:tcW w:w="1315" w:type="dxa"/>
-            <w:noWrap/>
-          </w:tcPr>
-          <w:p>
-            <w:r>
-              <w:t xml:space="preserve">$       </w:t>
-            </w:r>
-            <w:r>
-              <w:t xml:space="preserve"> 2</w:t>
-            </w:r>
-            <w:r>
-              <w:t xml:space="preserve">.00 </w:t>
-            </w:r>
-          </w:p>
-        </w:tc>
-        <w:tc>
-          <w:tcPr>
-            <w:tcW w:w="1440" w:type="dxa"/>
-            <w:noWrap/>
-          </w:tcPr>
-          <w:p>
-            <w:r>
-              <w:t xml:space="preserve">$       </w:t>
-            </w:r>
-            <w:r>
-              <w:t xml:space="preserve"> 2</w:t>
-            </w:r>
-            <w:r>
-              <w:t xml:space="preserve">.00 </w:t>
-            </w:r>
-          </w:p>
-        </w:tc>
-      </w:tr>
-      <w:tr>
-        <w:trPr>
-          <w:cantSplit/>
-          <w:trHeight w:val="300"/>
-        </w:trPr>
-        <w:tc>
-          <w:tcPr>
-            <w:tcW w:w="805" w:type="dxa"/>
-            <w:noWrap/>
-          </w:tcPr>
-          <w:p>
-            <w:pPr>
-              <w:jc w:val="right"/>
-              <w:rPr>
-                <w:rFonts w:ascii="Calibri" w:eastAsia="Times New Roman" w:hAnsi="Calibri" w:cs="Calibri"/>
-                <w:color w:val="000000"/>
-                <w:kern w:val="0"/>
-                <w14:ligatures w14:val="none"/>
-              </w:rPr>
-            </w:pPr>
-          </w:p>
-        </w:tc>
-        <w:tc>
-          <w:tcPr>
-            <w:tcW w:w="900" w:type="dxa"/>
-            <w:noWrap/>
-          </w:tcPr>
-          <w:p>
-            <w:pPr>
-              <w:jc w:val="right"/>
-              <w:rPr>
-                <w:rFonts w:ascii="Calibri" w:eastAsia="Times New Roman" w:hAnsi="Calibri" w:cs="Calibri"/>
-                <w:color w:val="000000"/>
-                <w:kern w:val="0"/>
-                <w14:ligatures w14:val="none"/>
-              </w:rPr>
-            </w:pPr>
-          </w:p>
-        </w:tc>
-        <w:tc>
-          <w:tcPr>
-            <w:tcW w:w="3905" w:type="dxa"/>
-            <w:noWrap/>
-          </w:tcPr>
-          <w:p>
-            <w:r>
-              <w:t>Total</w:t>
-            </w:r>
-          </w:p>
-        </w:tc>
-        <w:tc>
-          <w:tcPr>
-            <w:tcW w:w="1315" w:type="dxa"/>
-            <w:noWrap/>
-          </w:tcPr>
-          <w:p>
-            <w:pPr>
-              <w:rPr>
-                <w:rFonts w:ascii="Calibri" w:eastAsia="Times New Roman" w:hAnsi="Calibri" w:cs="Calibri"/>
-                <w:color w:val="000000"/>
-                <w:kern w:val="0"/>
-                <w14:ligatures w14:val="none"/>
-              </w:rPr>
-            </w:pPr>
-          </w:p>
-        </w:tc>
-        <w:tc>
-          <w:tcPr>
-            <w:tcW w:w="1440" w:type="dxa"/>
-            <w:noWrap/>
-          </w:tcPr>
-          <w:p>
-            <w:pPr>
-              <w:rPr>
-                <w:rFonts w:eastAsia="Times New Roman"/>
-                <w:kern w:val="0"/>
-                <w14:ligatures w14:val="none"/>
-              </w:rPr>
-            </w:pPr>
-            <w:r>
-              <w:t xml:space="preserve">$    95.17 </w:t>
-            </w:r>
-          </w:p>
-        </w:tc>
-      </w:tr>
-    </w:tbl>
-    <w:p/>
-    <w:p>
-      <w:pPr>
-        <w:spacing w:after="0"/>
-      </w:pPr>
-      <w:r>
-        <w:t>The following figure is a high level over of the whole project:</w:t>
-      </w:r>
-    </w:p>
-    <w:p>
-      <w:r>
-        <w:rPr>
           <w:noProof/>
         </w:rPr>
         <w:drawing>
-          <wp:inline distT="0" distB="0" distL="0" distR="0" wp14:anchorId="324E7BCD" wp14:editId="17A6767D">
-            <wp:extent cx="5943600" cy="3344545"/>
-            <wp:effectExtent l="0" t="0" r="0" b="8255"/>
-            <wp:docPr id="28663638" name="Picture 1" descr="A diagram of a computer system&#10;&#10;Description automatically generated"/>
+          <wp:inline distT="0" distB="0" distL="0" distR="0" wp14:anchorId="15FD13B8" wp14:editId="76BFDC97">
+            <wp:extent cx="6400800" cy="4800600"/>
+            <wp:effectExtent l="0" t="0" r="0" b="0"/>
+            <wp:docPr id="556855227" name="Picture 1" descr="A row of beer taps in front of a computer monitor">
+              <a:hlinkClick xmlns:a="http://schemas.openxmlformats.org/drawingml/2006/main" r:id="rId5"/>
+            </wp:docPr>
             <wp:cNvGraphicFramePr>
               <a:graphicFrameLocks xmlns:a="http://schemas.openxmlformats.org/drawingml/2006/main" noChangeAspect="1"/>
             </wp:cNvGraphicFramePr>
@@ -1269,13 +56,498 @@
               <a:graphicData uri="http://schemas.openxmlformats.org/drawingml/2006/picture">
                 <pic:pic xmlns:pic="http://schemas.openxmlformats.org/drawingml/2006/picture">
                   <pic:nvPicPr>
-                    <pic:cNvPr id="28663638" name="Picture 1" descr="A diagram of a computer system&#10;&#10;Description automatically generated"/>
+                    <pic:cNvPr id="556855227" name="Picture 1" descr="A row of beer taps in front of a computer monitor">
+                      <a:hlinkClick r:id="rId5"/>
+                    </pic:cNvPr>
+                    <pic:cNvPicPr/>
+                  </pic:nvPicPr>
+                  <pic:blipFill>
+                    <a:blip r:embed="rId6" cstate="print">
+                      <a:extLst>
+                        <a:ext uri="{28A0092B-C50C-407E-A947-70E740481C1C}">
+                          <a14:useLocalDpi xmlns:a14="http://schemas.microsoft.com/office/drawing/2010/main" val="0"/>
+                        </a:ext>
+                      </a:extLst>
+                    </a:blip>
+                    <a:stretch>
+                      <a:fillRect/>
+                    </a:stretch>
+                  </pic:blipFill>
+                  <pic:spPr>
+                    <a:xfrm>
+                      <a:off x="0" y="0"/>
+                      <a:ext cx="6400800" cy="4800600"/>
+                    </a:xfrm>
+                    <a:prstGeom prst="rect">
+                      <a:avLst/>
+                    </a:prstGeom>
+                  </pic:spPr>
+                </pic:pic>
+              </a:graphicData>
+            </a:graphic>
+          </wp:inline>
+        </w:drawing>
+      </w:r>
+    </w:p>
+    <w:p>
+      <w:pPr>
+        <w:pStyle w:val="Heading2"/>
+        <w:rPr>
+          <w:rFonts w:eastAsia="Times New Roman"/>
+        </w:rPr>
+      </w:pPr>
+      <w:r>
+        <w:rPr>
+          <w:rFonts w:eastAsia="Times New Roman"/>
+        </w:rPr>
+        <w:t>Features:</w:t>
+      </w:r>
+    </w:p>
+    <w:p>
+      <w:pPr>
+        <w:pStyle w:val="ListParagraph"/>
+        <w:numPr>
+          <w:ilvl w:val="0"/>
+          <w:numId w:val="6"/>
+        </w:numPr>
+      </w:pPr>
+      <w:r>
+        <w:t xml:space="preserve">Tracks </w:t>
+      </w:r>
+      <w:r>
+        <w:t xml:space="preserve">number of glasses </w:t>
+      </w:r>
+      <w:r>
+        <w:t>of beer left</w:t>
+      </w:r>
+      <w:r>
+        <w:t>.</w:t>
+      </w:r>
+    </w:p>
+    <w:p>
+      <w:pPr>
+        <w:pStyle w:val="ListParagraph"/>
+        <w:numPr>
+          <w:ilvl w:val="0"/>
+          <w:numId w:val="6"/>
+        </w:numPr>
+      </w:pPr>
+      <w:r>
+        <w:t>Controls Beer freezer temperature</w:t>
+      </w:r>
+    </w:p>
+    <w:p>
+      <w:pPr>
+        <w:pStyle w:val="ListParagraph"/>
+        <w:numPr>
+          <w:ilvl w:val="0"/>
+          <w:numId w:val="6"/>
+        </w:numPr>
+      </w:pPr>
+      <w:r>
+        <w:t xml:space="preserve">Provides email and text message </w:t>
+      </w:r>
+      <w:r>
+        <w:t>notification</w:t>
+      </w:r>
+      <w:r>
+        <w:t>s.</w:t>
+      </w:r>
+    </w:p>
+    <w:p>
+      <w:pPr>
+        <w:pStyle w:val="ListParagraph"/>
+        <w:numPr>
+          <w:ilvl w:val="0"/>
+          <w:numId w:val="6"/>
+        </w:numPr>
+      </w:pPr>
+      <w:r>
+        <w:t>Provides local and remote displays</w:t>
+      </w:r>
+      <w:r>
+        <w:t xml:space="preserve"> via Wi-Fi</w:t>
+      </w:r>
+      <w:r>
+        <w:t>.</w:t>
+      </w:r>
+    </w:p>
+    <w:p>
+      <w:pPr>
+        <w:pStyle w:val="ListParagraph"/>
+        <w:numPr>
+          <w:ilvl w:val="1"/>
+          <w:numId w:val="6"/>
+        </w:numPr>
+        <w:rPr>
+          <w:rFonts w:cs="Arial"/>
+          <w:color w:val="0F1111"/>
+          <w:sz w:val="21"/>
+          <w:szCs w:val="21"/>
+        </w:rPr>
+      </w:pPr>
+      <w:r>
+        <w:t>Accessible anywhere in the world with Port Forwarding</w:t>
+      </w:r>
+    </w:p>
+    <w:p>
+      <w:pPr>
+        <w:pStyle w:val="ListParagraph"/>
+        <w:numPr>
+          <w:ilvl w:val="0"/>
+          <w:numId w:val="6"/>
+        </w:numPr>
+      </w:pPr>
+      <w:r>
+        <w:t xml:space="preserve">Monitors up to </w:t>
+      </w:r>
+      <w:r>
+        <w:t>5</w:t>
+      </w:r>
+      <w:r>
+        <w:t xml:space="preserve"> beer taps.</w:t>
+      </w:r>
+    </w:p>
+    <w:p>
+      <w:pPr>
+        <w:pStyle w:val="ListParagraph"/>
+        <w:numPr>
+          <w:ilvl w:val="0"/>
+          <w:numId w:val="6"/>
+        </w:numPr>
+      </w:pPr>
+      <w:r>
+        <w:t>Temperature Stability +/- 0.75 degrees F</w:t>
+      </w:r>
+    </w:p>
+    <w:p>
+      <w:pPr>
+        <w:pStyle w:val="ListParagraph"/>
+        <w:numPr>
+          <w:ilvl w:val="0"/>
+          <w:numId w:val="6"/>
+        </w:numPr>
+      </w:pPr>
+      <w:r>
+        <w:t>Works with all DHT and/or MCP9808 Temperature Sensors</w:t>
+      </w:r>
+    </w:p>
+    <w:p>
+      <w:pPr>
+        <w:pStyle w:val="ListParagraph"/>
+        <w:numPr>
+          <w:ilvl w:val="1"/>
+          <w:numId w:val="6"/>
+        </w:numPr>
+      </w:pPr>
+      <w:r>
+        <w:t>Up</w:t>
+      </w:r>
+      <w:r>
+        <w:t xml:space="preserve"> </w:t>
+      </w:r>
+      <w:r>
+        <w:t xml:space="preserve">to 3 </w:t>
+      </w:r>
+      <w:r>
+        <w:t xml:space="preserve">temperature </w:t>
+      </w:r>
+      <w:r>
+        <w:t xml:space="preserve">sensors can be </w:t>
+      </w:r>
+      <w:r>
+        <w:t>used.</w:t>
+      </w:r>
+    </w:p>
+    <w:p>
+      <w:pPr>
+        <w:pStyle w:val="Heading2"/>
+        <w:rPr>
+          <w:rFonts w:eastAsia="Times New Roman"/>
+        </w:rPr>
+      </w:pPr>
+      <w:r>
+        <w:rPr>
+          <w:rFonts w:eastAsia="Times New Roman"/>
+        </w:rPr>
+        <w:lastRenderedPageBreak/>
+        <w:t>Introduction</w:t>
+      </w:r>
+    </w:p>
+    <w:p>
+      <w:r>
+        <w:t>Currently there are two types of systems to measure how much beer is left in the keg:</w:t>
+      </w:r>
+    </w:p>
+    <w:p>
+      <w:pPr>
+        <w:pStyle w:val="ListParagraph"/>
+        <w:numPr>
+          <w:ilvl w:val="0"/>
+          <w:numId w:val="2"/>
+        </w:numPr>
+      </w:pPr>
+      <w:r>
+        <w:t>Flow measuring.</w:t>
+      </w:r>
+    </w:p>
+    <w:p>
+      <w:pPr>
+        <w:pStyle w:val="ListParagraph"/>
+        <w:numPr>
+          <w:ilvl w:val="0"/>
+          <w:numId w:val="2"/>
+        </w:numPr>
+      </w:pPr>
+      <w:r>
+        <w:t>Weight of Keg.</w:t>
+      </w:r>
+    </w:p>
+    <w:p>
+      <w:r>
+        <w:t>Flow measuring systems are cheaper (6 taps about $500</w:t>
+      </w:r>
+      <w:proofErr w:type="gramStart"/>
+      <w:r>
+        <w:t>)</w:t>
+      </w:r>
+      <w:proofErr w:type="gramEnd"/>
+      <w:r>
+        <w:t xml:space="preserve"> but they have limited utility and you have to clean them every time you clean your beer lines (every 6 weeks).</w:t>
+      </w:r>
+    </w:p>
+    <w:p>
+      <w:r>
+        <w:t>Weight of keg systems are none intrusive, but very expensive ($1000 for 5 taps).  They are not integrated with your entire system.</w:t>
+      </w:r>
+      <w:r>
+        <w:t xml:space="preserve">  This system </w:t>
+      </w:r>
+      <w:r>
+        <w:t>measures the weight of the keg but is low cost.</w:t>
+      </w:r>
+    </w:p>
+    <w:p>
+      <w:pPr>
+        <w:pStyle w:val="Heading2"/>
+      </w:pPr>
+      <w:r>
+        <w:t>Bill of Materials</w:t>
+      </w:r>
+    </w:p>
+    <w:p>
+      <w:r>
+        <w:t>The following is the bill of Materials for the entire system:</w:t>
+      </w:r>
+      <w:r>
+        <w:t xml:space="preserve"> </w:t>
+      </w:r>
+    </w:p>
+    <w:p>
+      <w:r>
+        <w:rPr>
+          <w:noProof/>
+        </w:rPr>
+        <w:drawing>
+          <wp:inline distT="0" distB="0" distL="0" distR="0" wp14:anchorId="26A51C4D" wp14:editId="024CAB15">
+            <wp:extent cx="6324600" cy="3105150"/>
+            <wp:effectExtent l="0" t="0" r="0" b="0"/>
+            <wp:docPr id="1915640342" name="Picture 14" descr="A table with numbers and symbols&#10;&#10;Description automatically generated">
+              <a:hlinkClick xmlns:a="http://schemas.openxmlformats.org/drawingml/2006/main" r:id="rId7"/>
+            </wp:docPr>
+            <wp:cNvGraphicFramePr>
+              <a:graphicFrameLocks xmlns:a="http://schemas.openxmlformats.org/drawingml/2006/main" noChangeAspect="1"/>
+            </wp:cNvGraphicFramePr>
+            <a:graphic xmlns:a="http://schemas.openxmlformats.org/drawingml/2006/main">
+              <a:graphicData uri="http://schemas.openxmlformats.org/drawingml/2006/picture">
+                <pic:pic xmlns:pic="http://schemas.openxmlformats.org/drawingml/2006/picture">
+                  <pic:nvPicPr>
+                    <pic:cNvPr id="1915640342" name="Picture 14" descr="A table with numbers and symbols&#10;&#10;Description automatically generated">
+                      <a:hlinkClick r:id="rId7"/>
+                    </pic:cNvPr>
+                    <pic:cNvPicPr/>
+                  </pic:nvPicPr>
+                  <pic:blipFill>
+                    <a:blip r:embed="rId8">
+                      <a:extLst>
+                        <a:ext uri="{28A0092B-C50C-407E-A947-70E740481C1C}">
+                          <a14:useLocalDpi xmlns:a14="http://schemas.microsoft.com/office/drawing/2010/main" val="0"/>
+                        </a:ext>
+                      </a:extLst>
+                    </a:blip>
+                    <a:stretch>
+                      <a:fillRect/>
+                    </a:stretch>
+                  </pic:blipFill>
+                  <pic:spPr>
+                    <a:xfrm>
+                      <a:off x="0" y="0"/>
+                      <a:ext cx="6324600" cy="3105150"/>
+                    </a:xfrm>
+                    <a:prstGeom prst="rect">
+                      <a:avLst/>
+                    </a:prstGeom>
+                  </pic:spPr>
+                </pic:pic>
+              </a:graphicData>
+            </a:graphic>
+          </wp:inline>
+        </w:drawing>
+      </w:r>
+    </w:p>
+    <w:p>
+      <w:pPr>
+        <w:pStyle w:val="Heading2"/>
+      </w:pPr>
+      <w:r>
+        <w:t xml:space="preserve">Tools </w:t>
+      </w:r>
+      <w:r>
+        <w:t>R</w:t>
+      </w:r>
+      <w:r>
+        <w:t>equired</w:t>
+      </w:r>
+    </w:p>
+    <w:p>
+      <w:pPr>
+        <w:pStyle w:val="ListParagraph"/>
+        <w:numPr>
+          <w:ilvl w:val="0"/>
+          <w:numId w:val="11"/>
+        </w:numPr>
+      </w:pPr>
+      <w:r>
+        <w:t>Soldering Iron</w:t>
+      </w:r>
+      <w:r>
+        <w:t xml:space="preserve"> (Amazon $10</w:t>
+      </w:r>
+      <w:r>
+        <w:t xml:space="preserve">, </w:t>
+      </w:r>
+      <w:r>
+        <w:t>Soldering Iron Kit - 9-in-1 With 5 Tips, Solder Wire</w:t>
+      </w:r>
+      <w:r>
+        <w:t>)</w:t>
+      </w:r>
+    </w:p>
+    <w:p>
+      <w:pPr>
+        <w:pStyle w:val="ListParagraph"/>
+        <w:numPr>
+          <w:ilvl w:val="0"/>
+          <w:numId w:val="11"/>
+        </w:numPr>
+      </w:pPr>
+      <w:r>
+        <w:t>Connectors and Crimping Tool</w:t>
+      </w:r>
+      <w:r>
+        <w:t xml:space="preserve"> (Amazon</w:t>
+      </w:r>
+      <w:r>
+        <w:t xml:space="preserve"> $</w:t>
+      </w:r>
+      <w:r>
+        <w:t>30,</w:t>
+      </w:r>
+      <w:r>
+        <w:t xml:space="preserve"> </w:t>
+      </w:r>
+      <w:r>
+        <w:t>Kit with 1550PCS Male and Female 2.54mm Terminals</w:t>
+      </w:r>
+      <w:r>
+        <w:t>)</w:t>
+      </w:r>
+    </w:p>
+    <w:p>
+      <w:pPr>
+        <w:pStyle w:val="ListParagraph"/>
+        <w:numPr>
+          <w:ilvl w:val="0"/>
+          <w:numId w:val="11"/>
+        </w:numPr>
+      </w:pPr>
+      <w:r>
+        <w:t>Multi Meter (Recommended</w:t>
+      </w:r>
+      <w:r>
+        <w:t xml:space="preserve"> Harbor Freight $7, </w:t>
+      </w:r>
+      <w:r>
+        <w:t>7-Function Digital Multimeter</w:t>
+      </w:r>
+      <w:r>
+        <w:t>)</w:t>
+      </w:r>
+    </w:p>
+    <w:p>
+      <w:pPr>
+        <w:pStyle w:val="ListParagraph"/>
+        <w:numPr>
+          <w:ilvl w:val="0"/>
+          <w:numId w:val="11"/>
+        </w:numPr>
+      </w:pPr>
+      <w:r>
+        <w:t>Drill Motor</w:t>
+      </w:r>
+      <w:r>
+        <w:t xml:space="preserve"> </w:t>
+      </w:r>
+    </w:p>
+    <w:p>
+      <w:pPr>
+        <w:pStyle w:val="ListParagraph"/>
+        <w:numPr>
+          <w:ilvl w:val="0"/>
+          <w:numId w:val="11"/>
+        </w:numPr>
+      </w:pPr>
+      <w:r>
+        <w:t>Small Pliers, screw drivers</w:t>
+      </w:r>
+    </w:p>
+    <w:p>
+      <w:pPr>
+        <w:spacing w:after="0"/>
+      </w:pPr>
+      <w:r>
+        <w:t>The following figure is a high level over of the whole project:</w:t>
+      </w:r>
+    </w:p>
+    <w:p>
+      <w:r>
+        <w:rPr>
+          <w:noProof/>
+        </w:rPr>
+        <w:lastRenderedPageBreak/>
+        <w:drawing>
+          <wp:inline distT="0" distB="0" distL="0" distR="0" wp14:anchorId="324E7BCD" wp14:editId="4926F633">
+            <wp:extent cx="5943600" cy="3344545"/>
+            <wp:effectExtent l="0" t="0" r="0" b="8255"/>
+            <wp:docPr id="28663638" name="Picture 1" descr="A diagram of a computer system&#10;&#10;Description automatically generated">
+              <a:hlinkClick xmlns:a="http://schemas.openxmlformats.org/drawingml/2006/main" r:id="rId9"/>
+            </wp:docPr>
+            <wp:cNvGraphicFramePr>
+              <a:graphicFrameLocks xmlns:a="http://schemas.openxmlformats.org/drawingml/2006/main" noChangeAspect="1"/>
+            </wp:cNvGraphicFramePr>
+            <a:graphic xmlns:a="http://schemas.openxmlformats.org/drawingml/2006/main">
+              <a:graphicData uri="http://schemas.openxmlformats.org/drawingml/2006/picture">
+                <pic:pic xmlns:pic="http://schemas.openxmlformats.org/drawingml/2006/picture">
+                  <pic:nvPicPr>
+                    <pic:cNvPr id="28663638" name="Picture 1" descr="A diagram of a computer system&#10;&#10;Description automatically generated">
+                      <a:hlinkClick r:id="rId9"/>
+                    </pic:cNvPr>
                     <pic:cNvPicPr>
                       <a:picLocks noChangeAspect="1" noChangeArrowheads="1"/>
                     </pic:cNvPicPr>
                   </pic:nvPicPr>
                   <pic:blipFill>
-                    <a:blip r:embed="rId5">
+                    <a:blip r:embed="rId10">
                       <a:extLst>
                         <a:ext uri="{28A0092B-C50C-407E-A947-70E740481C1C}">
                           <a14:useLocalDpi xmlns:a14="http://schemas.microsoft.com/office/drawing/2010/main" val="0"/>
@@ -1380,7 +652,35 @@
     </w:p>
     <w:p>
       <w:r>
-        <w:t xml:space="preserve">The beer freezer is in the pool shack which does not have </w:t>
+        <w:t>The above block diagram shows the entire system.</w:t>
+      </w:r>
+    </w:p>
+    <w:p>
+      <w:r>
+        <w:t>If your beer storage unit already has temperature control</w:t>
+      </w:r>
+      <w:r>
+        <w:t xml:space="preserve">, you will not need the temperature sensors or relay.  If you only </w:t>
+      </w:r>
+      <w:r>
+        <w:t xml:space="preserve">want a local </w:t>
+      </w:r>
+      <w:r>
+        <w:t>display,</w:t>
+      </w:r>
+      <w:r>
+        <w:t xml:space="preserve"> you can eliminate the ESP32 D1 R</w:t>
+      </w:r>
+      <w:r>
+        <w:t xml:space="preserve">32 board and the interface wire.  </w:t>
+      </w:r>
+    </w:p>
+    <w:p>
+      <w:r>
+        <w:t xml:space="preserve">My </w:t>
+      </w:r>
+      <w:r>
+        <w:t xml:space="preserve">beer freezer is in the pool shack which does not have </w:t>
       </w:r>
       <w:r>
         <w:t>Wi-Fi</w:t>
@@ -1398,37 +698,7 @@
         <w:t>They</w:t>
       </w:r>
       <w:r>
-        <w:t xml:space="preserve"> talk to each other on a serial interface. If you have </w:t>
-      </w:r>
-      <w:r>
-        <w:t>Wi-Fi</w:t>
-      </w:r>
-      <w:r>
-        <w:t xml:space="preserve"> where your beer is </w:t>
-      </w:r>
-      <w:r>
-        <w:t>stored,</w:t>
-      </w:r>
-      <w:r>
-        <w:t xml:space="preserve"> you can get rid of the ESP32 board and the serial interface. </w:t>
-      </w:r>
-      <w:r>
-        <w:t xml:space="preserve">If you don’t want </w:t>
-      </w:r>
-      <w:r>
-        <w:t>Wi</w:t>
-      </w:r>
-      <w:r>
-        <w:t>-Fi</w:t>
-      </w:r>
-      <w:r>
-        <w:t xml:space="preserve"> display</w:t>
-      </w:r>
-      <w:r>
-        <w:t>, you can also get rid of this interface</w:t>
-      </w:r>
-      <w:r>
-        <w:t>.</w:t>
+        <w:t xml:space="preserve"> talk to each other on a serial interface.</w:t>
       </w:r>
     </w:p>
     <w:p>
@@ -1436,7 +706,6 @@
         <w:pStyle w:val="Heading2"/>
       </w:pPr>
       <w:r>
-        <w:lastRenderedPageBreak/>
         <w:t>Theory of Operation</w:t>
       </w:r>
     </w:p>
@@ -1531,6 +800,7 @@
         <w:pStyle w:val="Heading2"/>
       </w:pPr>
       <w:r>
+        <w:lastRenderedPageBreak/>
         <w:t>Software</w:t>
       </w:r>
     </w:p>
@@ -1558,6 +828,761 @@
       <w:r>
         <w:t>Hardware</w:t>
       </w:r>
+    </w:p>
+    <w:p>
+      <w:pPr>
+        <w:pStyle w:val="Heading3"/>
+      </w:pPr>
+      <w:r>
+        <w:t>VGA Monitor</w:t>
+      </w:r>
+    </w:p>
+    <w:p>
+      <w:r>
+        <w:t xml:space="preserve">For this project I selected a VGA monitor for my local display. VGA monitors are large and easy to read for my guests. They are also readily available and cheap. I got mine free at a garage sale. They were </w:t>
+      </w:r>
+      <w:r>
+        <w:t>closing</w:t>
+      </w:r>
+      <w:r>
+        <w:t xml:space="preserve"> and the monitor was still there, so they gave it to me. I also bought a VGA monitor at a thrift store for 10 dollars. The monitor came with a power cord and VGA cable.</w:t>
+      </w:r>
+    </w:p>
+    <w:p>
+      <w:pPr>
+        <w:pStyle w:val="Heading4"/>
+      </w:pPr>
+      <w:r>
+        <w:t>VGA Adapter</w:t>
+      </w:r>
+      <w:r>
+        <w:t xml:space="preserve"> </w:t>
+      </w:r>
+    </w:p>
+    <w:p>
+      <w:r>
+        <w:t xml:space="preserve">You need a VGA </w:t>
+      </w:r>
+      <w:r>
+        <w:t xml:space="preserve">adapter to connect the VGA cable to your processor board.  I used a </w:t>
+      </w:r>
+      <w:r>
+        <w:t>VGA Female 3 Row 15Pin Connector Breakout adapter</w:t>
+      </w:r>
+      <w:r>
+        <w:t xml:space="preserve"> shown on the right. Available from Amazon.</w:t>
+      </w:r>
+    </w:p>
+    <w:p>
+      <w:pPr>
+        <w:pStyle w:val="Heading2"/>
+      </w:pPr>
+      <w:r>
+        <w:t>Keyboard</w:t>
+      </w:r>
+    </w:p>
+    <w:p>
+      <w:r>
+        <w:t xml:space="preserve">I selected a PS2 keyboard for this project because they are very easy to interface. You can normally find PS2 keyboards at garage sales and thrift stores, but they are getting harder to find. You can tell it is a PS2 keyboard by the distinctive round PS2 connector. For </w:t>
+      </w:r>
+      <w:r>
+        <w:t>a while</w:t>
+      </w:r>
+      <w:r>
+        <w:t xml:space="preserve"> they made PS2 compatible keyboards with a USB connector, but unless the keyboard specifically says PS2 compatible it will not work. If you can't find a used PS2 keyboard, new ones are available on Amazon for about 20 dollars.</w:t>
+      </w:r>
+    </w:p>
+    <w:p>
+      <w:pPr>
+        <w:rPr>
+          <w:rFonts w:ascii="Times New Roman" w:hAnsi="Times New Roman"/>
+        </w:rPr>
+      </w:pPr>
+      <w:r>
+        <w:t xml:space="preserve">The PS2 keyboard requires 5 volts to operate and the ESP32 operates on 3.3 volts. </w:t>
+      </w:r>
+      <w:r>
+        <w:t>So,</w:t>
+      </w:r>
+      <w:r>
+        <w:t xml:space="preserve"> you need to make sure that the keyboard is wired to 5 volts and the pullup resisters are connected to the </w:t>
+      </w:r>
+      <w:r>
+        <w:t>3.3-volt</w:t>
+      </w:r>
+      <w:r>
+        <w:t xml:space="preserve"> supply. The PS2 output is an open collector interface.</w:t>
+      </w:r>
+    </w:p>
+    <w:p>
+      <w:r>
+        <w:t xml:space="preserve">PS2 breakout adapters like the one shown are </w:t>
+      </w:r>
+      <w:r>
+        <w:t>available but</w:t>
+      </w:r>
+      <w:r>
+        <w:t xml:space="preserve"> can be hard to find. There are USB to PS2 adapters readily available, so you can use a USB breakout adapter instead.</w:t>
+      </w:r>
+    </w:p>
+    <w:p>
+      <w:pPr>
+        <w:pStyle w:val="Heading3"/>
+      </w:pPr>
+      <w:r>
+        <w:t xml:space="preserve">Freezer Control Relay </w:t>
+      </w:r>
+    </w:p>
+    <w:p>
+      <w:r>
+        <w:t xml:space="preserve">The Freezer Control Relay is used to turn </w:t>
+      </w:r>
+      <w:proofErr w:type="gramStart"/>
+      <w:r>
+        <w:t>On</w:t>
+      </w:r>
+      <w:proofErr w:type="gramEnd"/>
+      <w:r>
+        <w:t>/Off the freezer. If you are using a refrigerator</w:t>
+      </w:r>
+      <w:r>
+        <w:t xml:space="preserve"> or already have a freezer controller </w:t>
+      </w:r>
+      <w:r>
+        <w:t>you do not</w:t>
+      </w:r>
+      <w:r>
+        <w:t xml:space="preserve"> need</w:t>
+      </w:r>
+      <w:r>
+        <w:t xml:space="preserve"> this relay.</w:t>
+      </w:r>
+    </w:p>
+    <w:p>
+      <w:r>
+        <w:t xml:space="preserve">The </w:t>
+      </w:r>
+      <w:r>
+        <w:t xml:space="preserve">relay </w:t>
+      </w:r>
+      <w:r>
+        <w:t xml:space="preserve">switch </w:t>
+      </w:r>
+      <w:r>
+        <w:t xml:space="preserve">is </w:t>
+      </w:r>
+      <w:r>
+        <w:t>250VAC and 10A load</w:t>
+      </w:r>
+      <w:r>
+        <w:t xml:space="preserve"> with </w:t>
+      </w:r>
+      <w:r>
+        <w:t>an Optocoupler</w:t>
+      </w:r>
+      <w:r>
+        <w:t xml:space="preserve"> Isolator:</w:t>
+      </w:r>
+      <w:r>
+        <w:t xml:space="preserve"> </w:t>
+      </w:r>
+      <w:r>
+        <w:t>3.3V power relay module.</w:t>
+      </w:r>
+      <w:r>
+        <w:t xml:space="preserve">  </w:t>
+      </w:r>
+      <w:r>
+        <w:t xml:space="preserve">The freezer I use was an Insignia™ - 10.2 Cu. Ft. Chest Freezer. The </w:t>
+      </w:r>
+      <w:r>
+        <w:t>startup</w:t>
+      </w:r>
+      <w:r>
+        <w:t xml:space="preserve"> current is 21.4 amps and the </w:t>
+      </w:r>
+      <w:r>
+        <w:t>on</w:t>
+      </w:r>
+      <w:r>
+        <w:t xml:space="preserve"> current is 2.0 amps. The relay has handled the startup current fine.</w:t>
+      </w:r>
+      <w:r>
+        <w:t xml:space="preserve">  I installed the relay in a standard electrical box as shown in the following figure.</w:t>
+      </w:r>
+    </w:p>
+    <w:p>
+      <w:pPr>
+        <w:pStyle w:val="NormalWeb"/>
+      </w:pPr>
+      <w:r>
+        <w:rPr>
+          <w:noProof/>
+        </w:rPr>
+        <w:lastRenderedPageBreak/>
+        <w:drawing>
+          <wp:inline distT="0" distB="0" distL="0" distR="0" wp14:anchorId="3497AE1C" wp14:editId="6203DF6B">
+            <wp:extent cx="6400800" cy="3601085"/>
+            <wp:effectExtent l="0" t="0" r="0" b="0"/>
+            <wp:docPr id="357876475" name="Picture 4" descr="A diagram of a relay&#10;&#10;Description automatically generated"/>
+            <wp:cNvGraphicFramePr>
+              <a:graphicFrameLocks xmlns:a="http://schemas.openxmlformats.org/drawingml/2006/main" noChangeAspect="1"/>
+            </wp:cNvGraphicFramePr>
+            <a:graphic xmlns:a="http://schemas.openxmlformats.org/drawingml/2006/main">
+              <a:graphicData uri="http://schemas.openxmlformats.org/drawingml/2006/picture">
+                <pic:pic xmlns:pic="http://schemas.openxmlformats.org/drawingml/2006/picture">
+                  <pic:nvPicPr>
+                    <pic:cNvPr id="357876475" name="Picture 4" descr="A diagram of a relay&#10;&#10;Description automatically generated"/>
+                    <pic:cNvPicPr>
+                      <a:picLocks noChangeAspect="1" noChangeArrowheads="1"/>
+                    </pic:cNvPicPr>
+                  </pic:nvPicPr>
+                  <pic:blipFill>
+                    <a:blip r:embed="rId11">
+                      <a:extLst>
+                        <a:ext uri="{28A0092B-C50C-407E-A947-70E740481C1C}">
+                          <a14:useLocalDpi xmlns:a14="http://schemas.microsoft.com/office/drawing/2010/main" val="0"/>
+                        </a:ext>
+                      </a:extLst>
+                    </a:blip>
+                    <a:srcRect/>
+                    <a:stretch>
+                      <a:fillRect/>
+                    </a:stretch>
+                  </pic:blipFill>
+                  <pic:spPr bwMode="auto">
+                    <a:xfrm>
+                      <a:off x="0" y="0"/>
+                      <a:ext cx="6400800" cy="3601085"/>
+                    </a:xfrm>
+                    <a:prstGeom prst="rect">
+                      <a:avLst/>
+                    </a:prstGeom>
+                    <a:noFill/>
+                    <a:ln>
+                      <a:noFill/>
+                    </a:ln>
+                  </pic:spPr>
+                </pic:pic>
+              </a:graphicData>
+            </a:graphic>
+          </wp:inline>
+        </w:drawing>
+      </w:r>
+    </w:p>
+    <w:p/>
+    <w:p>
+      <w:pPr>
+        <w:rPr>
+          <w:rFonts w:ascii="Times New Roman" w:hAnsi="Times New Roman"/>
+        </w:rPr>
+      </w:pPr>
+    </w:p>
+    <w:p>
+      <w:pPr>
+        <w:pStyle w:val="NormalWeb"/>
+      </w:pPr>
+    </w:p>
+    <w:p/>
+    <w:p>
+      <w:pPr>
+        <w:pStyle w:val="Heading2"/>
+      </w:pPr>
+      <w:r>
+        <w:t>Processor Board</w:t>
+      </w:r>
+    </w:p>
+    <w:p>
+      <w:pPr>
+        <w:rPr>
+          <w:rFonts w:ascii="Times New Roman" w:hAnsi="Times New Roman"/>
+        </w:rPr>
+      </w:pPr>
+      <w:r>
+        <w:t xml:space="preserve">For this project I selected the FREENOVE ESP32-WROOM </w:t>
+      </w:r>
+      <w:r>
+        <w:t>development</w:t>
+      </w:r>
+      <w:r>
+        <w:t xml:space="preserve"> board. The main reason is the breakout board that is available for this board. The breakout board is great. I prefer to use </w:t>
+      </w:r>
+      <w:r>
+        <w:t>an</w:t>
+      </w:r>
+      <w:r>
+        <w:t xml:space="preserve"> Arduino power supply </w:t>
+      </w:r>
+      <w:r>
+        <w:t xml:space="preserve">connector </w:t>
+      </w:r>
+      <w:proofErr w:type="gramStart"/>
+      <w:r>
+        <w:t>instead</w:t>
+      </w:r>
+      <w:proofErr w:type="gramEnd"/>
+      <w:r>
+        <w:t xml:space="preserve"> a type C USB connector.</w:t>
+      </w:r>
+      <w:r>
+        <w:t xml:space="preserve">  The parts are shown in the following figure.  I also used a distr</w:t>
+      </w:r>
+      <w:r>
+        <w:t>ibution board for all the power and ground connections.</w:t>
+      </w:r>
+    </w:p>
+    <w:p>
+      <w:pPr>
+        <w:pStyle w:val="Heading2"/>
+        <w:rPr>
+          <w:rFonts w:ascii="Times New Roman" w:hAnsi="Times New Roman"/>
+        </w:rPr>
+      </w:pPr>
+      <w:r>
+        <w:rPr>
+          <w:noProof/>
+        </w:rPr>
+        <w:lastRenderedPageBreak/>
+        <w:drawing>
+          <wp:inline distT="0" distB="0" distL="0" distR="0" wp14:anchorId="1AEB4C69" wp14:editId="38711859">
+            <wp:extent cx="6400800" cy="3601085"/>
+            <wp:effectExtent l="0" t="0" r="0" b="0"/>
+            <wp:docPr id="1278734618" name="Picture 2" descr="A close-up of a circuit board&#10;&#10;Description automatically generated"/>
+            <wp:cNvGraphicFramePr>
+              <a:graphicFrameLocks xmlns:a="http://schemas.openxmlformats.org/drawingml/2006/main" noChangeAspect="1"/>
+            </wp:cNvGraphicFramePr>
+            <a:graphic xmlns:a="http://schemas.openxmlformats.org/drawingml/2006/main">
+              <a:graphicData uri="http://schemas.openxmlformats.org/drawingml/2006/picture">
+                <pic:pic xmlns:pic="http://schemas.openxmlformats.org/drawingml/2006/picture">
+                  <pic:nvPicPr>
+                    <pic:cNvPr id="1278734618" name="Picture 2" descr="A close-up of a circuit board&#10;&#10;Description automatically generated"/>
+                    <pic:cNvPicPr>
+                      <a:picLocks noChangeAspect="1" noChangeArrowheads="1"/>
+                    </pic:cNvPicPr>
+                  </pic:nvPicPr>
+                  <pic:blipFill>
+                    <a:blip r:embed="rId12">
+                      <a:extLst>
+                        <a:ext uri="{28A0092B-C50C-407E-A947-70E740481C1C}">
+                          <a14:useLocalDpi xmlns:a14="http://schemas.microsoft.com/office/drawing/2010/main" val="0"/>
+                        </a:ext>
+                      </a:extLst>
+                    </a:blip>
+                    <a:srcRect/>
+                    <a:stretch>
+                      <a:fillRect/>
+                    </a:stretch>
+                  </pic:blipFill>
+                  <pic:spPr bwMode="auto">
+                    <a:xfrm>
+                      <a:off x="0" y="0"/>
+                      <a:ext cx="6400800" cy="3601085"/>
+                    </a:xfrm>
+                    <a:prstGeom prst="rect">
+                      <a:avLst/>
+                    </a:prstGeom>
+                    <a:noFill/>
+                    <a:ln>
+                      <a:noFill/>
+                    </a:ln>
+                  </pic:spPr>
+                </pic:pic>
+              </a:graphicData>
+            </a:graphic>
+          </wp:inline>
+        </w:drawing>
+      </w:r>
+    </w:p>
+    <w:p>
+      <w:pPr>
+        <w:pStyle w:val="Heading2"/>
+        <w:rPr>
+          <w:rFonts w:ascii="Times New Roman" w:hAnsi="Times New Roman"/>
+        </w:rPr>
+      </w:pPr>
+      <w:r>
+        <w:t>Scales</w:t>
+      </w:r>
+    </w:p>
+    <w:p>
+      <w:pPr>
+        <w:pStyle w:val="NormalWeb"/>
+        <w:shd w:val="clear" w:color="auto" w:fill="FFFFFF"/>
+        <w:spacing w:before="45" w:beforeAutospacing="0" w:after="300" w:afterAutospacing="0"/>
+        <w:rPr>
+          <w:rFonts w:ascii="Helvetica" w:hAnsi="Helvetica" w:cs="Helvetica"/>
+          <w:color w:val="555555"/>
+          <w:sz w:val="30"/>
+          <w:szCs w:val="30"/>
+        </w:rPr>
+      </w:pPr>
+      <w:r>
+        <w:rPr>
+          <w:rFonts w:ascii="Helvetica" w:hAnsi="Helvetica" w:cs="Helvetica"/>
+          <w:color w:val="555555"/>
+          <w:sz w:val="30"/>
+          <w:szCs w:val="30"/>
+        </w:rPr>
+        <w:t>For the scale plate I used Aluminum Composite Sign Panel sheet. The sheets are 1/8 inch thick and come in a variety of sizes. The most common is 12 inches by 24 inches. You can use standard wood cutting tools to work with the plates.</w:t>
+      </w:r>
+    </w:p>
+    <w:p>
+      <w:pPr>
+        <w:pStyle w:val="NormalWeb"/>
+        <w:shd w:val="clear" w:color="auto" w:fill="FFFFFF"/>
+        <w:spacing w:before="45" w:beforeAutospacing="0" w:after="300" w:afterAutospacing="0"/>
+        <w:rPr>
+          <w:rFonts w:ascii="Helvetica" w:hAnsi="Helvetica" w:cs="Helvetica"/>
+          <w:color w:val="555555"/>
+          <w:sz w:val="30"/>
+          <w:szCs w:val="30"/>
+        </w:rPr>
+      </w:pPr>
+      <w:r>
+        <w:rPr>
+          <w:rFonts w:ascii="Helvetica" w:hAnsi="Helvetica" w:cs="Helvetica"/>
+          <w:color w:val="555555"/>
+          <w:sz w:val="30"/>
+          <w:szCs w:val="30"/>
+        </w:rPr>
+        <w:t>I made two sizes of scale plates. 9.25 inches for Corny and 1/6 Barrel kegs. 12.125 for the Slim 1/4 Barrel.</w:t>
+      </w:r>
+    </w:p>
+    <w:p>
+      <w:pPr>
+        <w:pStyle w:val="Heading3"/>
+        <w:shd w:val="clear" w:color="auto" w:fill="FFFFFF"/>
+        <w:spacing w:before="0" w:after="0"/>
+        <w:rPr>
+          <w:rFonts w:ascii="Helvetica" w:hAnsi="Helvetica" w:cs="Helvetica"/>
+          <w:color w:val="555555"/>
+          <w:sz w:val="36"/>
+          <w:szCs w:val="36"/>
+        </w:rPr>
+      </w:pPr>
+      <w:r>
+        <w:rPr>
+          <w:rFonts w:ascii="Helvetica" w:hAnsi="Helvetica" w:cs="Helvetica"/>
+          <w:color w:val="555555"/>
+          <w:sz w:val="36"/>
+          <w:szCs w:val="36"/>
+        </w:rPr>
+        <w:t>Making the Scales</w:t>
+      </w:r>
+    </w:p>
+    <w:p>
+      <w:pPr>
+        <w:pStyle w:val="NormalWeb"/>
+        <w:shd w:val="clear" w:color="auto" w:fill="FFFFFF"/>
+        <w:spacing w:before="45" w:beforeAutospacing="0" w:after="300" w:afterAutospacing="0"/>
+        <w:rPr>
+          <w:rFonts w:ascii="Helvetica" w:hAnsi="Helvetica" w:cs="Helvetica"/>
+          <w:color w:val="555555"/>
+          <w:sz w:val="30"/>
+          <w:szCs w:val="30"/>
+        </w:rPr>
+      </w:pPr>
+      <w:r>
+        <w:rPr>
+          <w:rFonts w:ascii="Helvetica" w:hAnsi="Helvetica" w:cs="Helvetica"/>
+          <w:color w:val="555555"/>
+          <w:sz w:val="30"/>
+          <w:szCs w:val="30"/>
+        </w:rPr>
+        <w:t xml:space="preserve">I used two different methods to make the scales. The figures show the two different methods. For the first one I used a table router and a table saw. The holes are for the strain gauge and on the center line of the plate. I made them through holes so you can align the strain gauge in the slot. I routed an </w:t>
+      </w:r>
+      <w:proofErr w:type="gramStart"/>
+      <w:r>
+        <w:rPr>
+          <w:rFonts w:ascii="Helvetica" w:hAnsi="Helvetica" w:cs="Helvetica"/>
+          <w:color w:val="555555"/>
+          <w:sz w:val="30"/>
+          <w:szCs w:val="30"/>
+        </w:rPr>
+        <w:t>area is</w:t>
+      </w:r>
+      <w:proofErr w:type="gramEnd"/>
+      <w:r>
+        <w:rPr>
+          <w:rFonts w:ascii="Helvetica" w:hAnsi="Helvetica" w:cs="Helvetica"/>
+          <w:color w:val="555555"/>
+          <w:sz w:val="30"/>
+          <w:szCs w:val="30"/>
+        </w:rPr>
+        <w:t xml:space="preserve"> for the HX711 board. You route out the area leaving a </w:t>
+      </w:r>
+      <w:proofErr w:type="gramStart"/>
+      <w:r>
+        <w:rPr>
+          <w:rFonts w:ascii="Helvetica" w:hAnsi="Helvetica" w:cs="Helvetica"/>
+          <w:color w:val="555555"/>
+          <w:sz w:val="30"/>
+          <w:szCs w:val="30"/>
+        </w:rPr>
+        <w:t>1/16 inch</w:t>
+      </w:r>
+      <w:proofErr w:type="gramEnd"/>
+      <w:r>
+        <w:rPr>
+          <w:rFonts w:ascii="Helvetica" w:hAnsi="Helvetica" w:cs="Helvetica"/>
+          <w:color w:val="555555"/>
+          <w:sz w:val="30"/>
+          <w:szCs w:val="30"/>
+        </w:rPr>
+        <w:t xml:space="preserve"> top. You cut a through area for the pins to go through the board.</w:t>
+      </w:r>
+    </w:p>
+    <w:p>
+      <w:pPr>
+        <w:pStyle w:val="NormalWeb"/>
+        <w:shd w:val="clear" w:color="auto" w:fill="FFFFFF"/>
+        <w:spacing w:before="45" w:beforeAutospacing="0" w:after="300" w:afterAutospacing="0"/>
+        <w:rPr>
+          <w:rFonts w:ascii="Helvetica" w:hAnsi="Helvetica" w:cs="Helvetica"/>
+          <w:color w:val="555555"/>
+          <w:sz w:val="30"/>
+          <w:szCs w:val="30"/>
+        </w:rPr>
+      </w:pPr>
+      <w:r>
+        <w:rPr>
+          <w:rFonts w:ascii="Helvetica" w:hAnsi="Helvetica" w:cs="Helvetica"/>
+          <w:color w:val="555555"/>
+          <w:sz w:val="30"/>
+          <w:szCs w:val="30"/>
+        </w:rPr>
+        <w:t xml:space="preserve">With the scrap aluminum plate, I made some retainers to hold the </w:t>
+      </w:r>
+      <w:proofErr w:type="spellStart"/>
+      <w:r>
+        <w:rPr>
+          <w:rFonts w:ascii="Helvetica" w:hAnsi="Helvetica" w:cs="Helvetica"/>
+          <w:color w:val="555555"/>
+          <w:sz w:val="30"/>
+          <w:szCs w:val="30"/>
+        </w:rPr>
+        <w:t>the</w:t>
+      </w:r>
+      <w:proofErr w:type="spellEnd"/>
+      <w:r>
+        <w:rPr>
+          <w:rFonts w:ascii="Helvetica" w:hAnsi="Helvetica" w:cs="Helvetica"/>
+          <w:color w:val="555555"/>
+          <w:sz w:val="30"/>
+          <w:szCs w:val="30"/>
+        </w:rPr>
+        <w:t xml:space="preserve"> strain gauge retainer in place. For the retainers, you route out an area and again leave </w:t>
+      </w:r>
+      <w:proofErr w:type="gramStart"/>
+      <w:r>
+        <w:rPr>
+          <w:rFonts w:ascii="Helvetica" w:hAnsi="Helvetica" w:cs="Helvetica"/>
+          <w:color w:val="555555"/>
+          <w:sz w:val="30"/>
+          <w:szCs w:val="30"/>
+        </w:rPr>
+        <w:t>1/16 inch</w:t>
+      </w:r>
+      <w:proofErr w:type="gramEnd"/>
+      <w:r>
+        <w:rPr>
+          <w:rFonts w:ascii="Helvetica" w:hAnsi="Helvetica" w:cs="Helvetica"/>
+          <w:color w:val="555555"/>
+          <w:sz w:val="30"/>
+          <w:szCs w:val="30"/>
+        </w:rPr>
+        <w:t xml:space="preserve"> top material. The retainer only keeps the strain gauge from </w:t>
+      </w:r>
+      <w:r>
+        <w:rPr>
+          <w:rFonts w:ascii="Helvetica" w:hAnsi="Helvetica" w:cs="Helvetica"/>
+          <w:color w:val="555555"/>
+          <w:sz w:val="30"/>
+          <w:szCs w:val="30"/>
+        </w:rPr>
+        <w:lastRenderedPageBreak/>
+        <w:t>moving. All the keg weight is supported by the plate and the strain gauge. I also made a little retainer to hole the HX711 board in place.</w:t>
+      </w:r>
+    </w:p>
+    <w:p>
+      <w:pPr>
+        <w:pStyle w:val="NormalWeb"/>
+        <w:shd w:val="clear" w:color="auto" w:fill="FFFFFF"/>
+        <w:spacing w:before="45" w:beforeAutospacing="0" w:after="300" w:afterAutospacing="0"/>
+        <w:rPr>
+          <w:rFonts w:ascii="Helvetica" w:hAnsi="Helvetica" w:cs="Helvetica"/>
+          <w:color w:val="555555"/>
+          <w:sz w:val="30"/>
+          <w:szCs w:val="30"/>
+        </w:rPr>
+      </w:pPr>
+      <w:r>
+        <w:rPr>
+          <w:rFonts w:ascii="Helvetica" w:hAnsi="Helvetica" w:cs="Helvetica"/>
+          <w:color w:val="555555"/>
+          <w:sz w:val="30"/>
+          <w:szCs w:val="30"/>
+        </w:rPr>
+        <w:t>To hold the retainers in place I used 1/4-inch flat head machine screws. I drilled and tapped the plate to hold the screws. You can also use sheet metal screws, so you don't have to drill and tap.</w:t>
+      </w:r>
+    </w:p>
+    <w:p>
+      <w:pPr>
+        <w:pStyle w:val="NormalWeb"/>
+        <w:shd w:val="clear" w:color="auto" w:fill="FFFFFF"/>
+        <w:spacing w:before="45" w:beforeAutospacing="0" w:after="300" w:afterAutospacing="0"/>
+        <w:rPr>
+          <w:rFonts w:ascii="Helvetica" w:hAnsi="Helvetica" w:cs="Helvetica"/>
+          <w:color w:val="555555"/>
+          <w:sz w:val="30"/>
+          <w:szCs w:val="30"/>
+        </w:rPr>
+      </w:pPr>
+      <w:r>
+        <w:rPr>
+          <w:rFonts w:ascii="Helvetica" w:hAnsi="Helvetica" w:cs="Helvetica"/>
+          <w:color w:val="555555"/>
+          <w:sz w:val="30"/>
+          <w:szCs w:val="30"/>
+        </w:rPr>
+        <w:t xml:space="preserve">If you don't have a router </w:t>
+      </w:r>
+      <w:proofErr w:type="gramStart"/>
+      <w:r>
+        <w:rPr>
+          <w:rFonts w:ascii="Helvetica" w:hAnsi="Helvetica" w:cs="Helvetica"/>
+          <w:color w:val="555555"/>
+          <w:sz w:val="30"/>
+          <w:szCs w:val="30"/>
+        </w:rPr>
+        <w:t>table</w:t>
+      </w:r>
+      <w:proofErr w:type="gramEnd"/>
+      <w:r>
+        <w:rPr>
+          <w:rFonts w:ascii="Helvetica" w:hAnsi="Helvetica" w:cs="Helvetica"/>
+          <w:color w:val="555555"/>
+          <w:sz w:val="30"/>
+          <w:szCs w:val="30"/>
+        </w:rPr>
+        <w:t xml:space="preserve"> you can cut the holes in the plate and use sheet metal screws to hold the strain gauges and HX711 board in place.</w:t>
+      </w:r>
+    </w:p>
+    <w:p>
+      <w:pPr>
+        <w:pStyle w:val="Heading3"/>
+        <w:shd w:val="clear" w:color="auto" w:fill="FFFFFF"/>
+        <w:spacing w:before="0" w:after="0"/>
+        <w:rPr>
+          <w:rFonts w:ascii="Helvetica" w:hAnsi="Helvetica" w:cs="Helvetica"/>
+          <w:color w:val="555555"/>
+          <w:sz w:val="36"/>
+          <w:szCs w:val="36"/>
+        </w:rPr>
+      </w:pPr>
+      <w:r>
+        <w:rPr>
+          <w:rFonts w:ascii="Helvetica" w:hAnsi="Helvetica" w:cs="Helvetica"/>
+          <w:color w:val="555555"/>
+          <w:sz w:val="36"/>
+          <w:szCs w:val="36"/>
+        </w:rPr>
+        <w:t>Keg Holder</w:t>
+      </w:r>
+    </w:p>
+    <w:p>
+      <w:pPr>
+        <w:pStyle w:val="NormalWeb"/>
+        <w:shd w:val="clear" w:color="auto" w:fill="FFFFFF"/>
+        <w:spacing w:before="45" w:beforeAutospacing="0" w:after="300" w:afterAutospacing="0"/>
+        <w:rPr>
+          <w:rFonts w:ascii="Helvetica" w:hAnsi="Helvetica" w:cs="Helvetica"/>
+          <w:color w:val="555555"/>
+          <w:sz w:val="30"/>
+          <w:szCs w:val="30"/>
+        </w:rPr>
+      </w:pPr>
+      <w:r>
+        <w:rPr>
+          <w:rFonts w:ascii="Helvetica" w:hAnsi="Helvetica" w:cs="Helvetica"/>
+          <w:color w:val="555555"/>
+          <w:sz w:val="30"/>
+          <w:szCs w:val="30"/>
+        </w:rPr>
+        <w:t>I made keg holders for the kegs. It is important to use these to protect the HX711 connector from getting squashed and provide a hard surface for the strain gauge to sit on. My freezer bottom was soft and strain gauge pressure point went right into the bottom. The keg holder uses 1x2 lumber for the frame with a hard plate on the bottom. I used vinyl plank flooring on the bottom. It is completely waterproof, has a nice rubber backing for the bottom and has a very hard surface. The bottom is just nailed to the frame.</w:t>
+      </w:r>
+    </w:p>
+    <w:p>
+      <w:pPr>
+        <w:pStyle w:val="NormalWeb"/>
+        <w:rPr>
+          <w:noProof/>
+        </w:rPr>
+      </w:pPr>
+    </w:p>
+    <w:p>
+      <w:pPr>
+        <w:pStyle w:val="NormalWeb"/>
+      </w:pPr>
+      <w:r>
+        <w:rPr>
+          <w:noProof/>
+        </w:rPr>
+        <w:drawing>
+          <wp:inline distT="0" distB="0" distL="0" distR="0" wp14:anchorId="760898EC" wp14:editId="35027C19">
+            <wp:extent cx="6400800" cy="3601085"/>
+            <wp:effectExtent l="0" t="0" r="0" b="0"/>
+            <wp:docPr id="1213793217" name="Picture 5" descr="A close-up of a circuit board&#10;&#10;Description automatically generated"/>
+            <wp:cNvGraphicFramePr>
+              <a:graphicFrameLocks xmlns:a="http://schemas.openxmlformats.org/drawingml/2006/main" noChangeAspect="1"/>
+            </wp:cNvGraphicFramePr>
+            <a:graphic xmlns:a="http://schemas.openxmlformats.org/drawingml/2006/main">
+              <a:graphicData uri="http://schemas.openxmlformats.org/drawingml/2006/picture">
+                <pic:pic xmlns:pic="http://schemas.openxmlformats.org/drawingml/2006/picture">
+                  <pic:nvPicPr>
+                    <pic:cNvPr id="1213793217" name="Picture 5" descr="A close-up of a circuit board&#10;&#10;Description automatically generated"/>
+                    <pic:cNvPicPr>
+                      <a:picLocks noChangeAspect="1" noChangeArrowheads="1"/>
+                    </pic:cNvPicPr>
+                  </pic:nvPicPr>
+                  <pic:blipFill>
+                    <a:blip r:embed="rId13">
+                      <a:extLst>
+                        <a:ext uri="{28A0092B-C50C-407E-A947-70E740481C1C}">
+                          <a14:useLocalDpi xmlns:a14="http://schemas.microsoft.com/office/drawing/2010/main" val="0"/>
+                        </a:ext>
+                      </a:extLst>
+                    </a:blip>
+                    <a:srcRect/>
+                    <a:stretch>
+                      <a:fillRect/>
+                    </a:stretch>
+                  </pic:blipFill>
+                  <pic:spPr bwMode="auto">
+                    <a:xfrm>
+                      <a:off x="0" y="0"/>
+                      <a:ext cx="6400800" cy="3601085"/>
+                    </a:xfrm>
+                    <a:prstGeom prst="rect">
+                      <a:avLst/>
+                    </a:prstGeom>
+                    <a:noFill/>
+                    <a:ln>
+                      <a:noFill/>
+                    </a:ln>
+                  </pic:spPr>
+                </pic:pic>
+              </a:graphicData>
+            </a:graphic>
+          </wp:inline>
+        </w:drawing>
+      </w:r>
+    </w:p>
+    <w:p/>
+    <w:p>
+      <w:pPr>
+        <w:jc w:val="right"/>
+      </w:pPr>
     </w:p>
     <w:p>
       <w:r>
@@ -1728,7 +1753,6 @@
         </w:numPr>
       </w:pPr>
       <w:r>
-        <w:lastRenderedPageBreak/>
         <w:t>Use an Ohm meter to check everything out.  It can save a lot of troubleshooting time.</w:t>
       </w:r>
       <w:r>
@@ -1875,6 +1899,7 @@
     </w:p>
     <w:p>
       <w:r>
+        <w:lastRenderedPageBreak/>
         <w:t xml:space="preserve">I also installed a little fan in the freezer.  </w:t>
       </w:r>
       <w:r>
@@ -1889,7 +1914,13 @@
         <w:t xml:space="preserve">You can read about the temperature </w:t>
       </w:r>
       <w:r>
-        <w:t>sensors in hardware folder.</w:t>
+        <w:t xml:space="preserve">sensors in </w:t>
+      </w:r>
+      <w:r>
+        <w:t>the hardware</w:t>
+      </w:r>
+      <w:r>
+        <w:t xml:space="preserve"> folder.</w:t>
       </w:r>
     </w:p>
     <w:p/>
@@ -2747,6 +2778,119 @@
     </w:lvl>
   </w:abstractNum>
   <w:abstractNum w:abstractNumId="8" w15:restartNumberingAfterBreak="0">
+    <w:nsid w:val="6BF85676"/>
+    <w:multiLevelType w:val="hybridMultilevel"/>
+    <w:tmpl w:val="7450B1D4"/>
+    <w:lvl w:ilvl="0" w:tplc="04090001">
+      <w:start w:val="1"/>
+      <w:numFmt w:val="bullet"/>
+      <w:lvlText w:val=""/>
+      <w:lvlJc w:val="left"/>
+      <w:pPr>
+        <w:ind w:left="720" w:hanging="360"/>
+      </w:pPr>
+      <w:rPr>
+        <w:rFonts w:ascii="Symbol" w:hAnsi="Symbol" w:hint="default"/>
+      </w:rPr>
+    </w:lvl>
+    <w:lvl w:ilvl="1" w:tplc="04090003" w:tentative="1">
+      <w:start w:val="1"/>
+      <w:numFmt w:val="bullet"/>
+      <w:lvlText w:val="o"/>
+      <w:lvlJc w:val="left"/>
+      <w:pPr>
+        <w:ind w:left="1440" w:hanging="360"/>
+      </w:pPr>
+      <w:rPr>
+        <w:rFonts w:ascii="Courier New" w:hAnsi="Courier New" w:cs="Courier New" w:hint="default"/>
+      </w:rPr>
+    </w:lvl>
+    <w:lvl w:ilvl="2" w:tplc="04090005" w:tentative="1">
+      <w:start w:val="1"/>
+      <w:numFmt w:val="bullet"/>
+      <w:lvlText w:val=""/>
+      <w:lvlJc w:val="left"/>
+      <w:pPr>
+        <w:ind w:left="2160" w:hanging="360"/>
+      </w:pPr>
+      <w:rPr>
+        <w:rFonts w:ascii="Wingdings" w:hAnsi="Wingdings" w:hint="default"/>
+      </w:rPr>
+    </w:lvl>
+    <w:lvl w:ilvl="3" w:tplc="04090001" w:tentative="1">
+      <w:start w:val="1"/>
+      <w:numFmt w:val="bullet"/>
+      <w:lvlText w:val=""/>
+      <w:lvlJc w:val="left"/>
+      <w:pPr>
+        <w:ind w:left="2880" w:hanging="360"/>
+      </w:pPr>
+      <w:rPr>
+        <w:rFonts w:ascii="Symbol" w:hAnsi="Symbol" w:hint="default"/>
+      </w:rPr>
+    </w:lvl>
+    <w:lvl w:ilvl="4" w:tplc="04090003" w:tentative="1">
+      <w:start w:val="1"/>
+      <w:numFmt w:val="bullet"/>
+      <w:lvlText w:val="o"/>
+      <w:lvlJc w:val="left"/>
+      <w:pPr>
+        <w:ind w:left="3600" w:hanging="360"/>
+      </w:pPr>
+      <w:rPr>
+        <w:rFonts w:ascii="Courier New" w:hAnsi="Courier New" w:cs="Courier New" w:hint="default"/>
+      </w:rPr>
+    </w:lvl>
+    <w:lvl w:ilvl="5" w:tplc="04090005" w:tentative="1">
+      <w:start w:val="1"/>
+      <w:numFmt w:val="bullet"/>
+      <w:lvlText w:val=""/>
+      <w:lvlJc w:val="left"/>
+      <w:pPr>
+        <w:ind w:left="4320" w:hanging="360"/>
+      </w:pPr>
+      <w:rPr>
+        <w:rFonts w:ascii="Wingdings" w:hAnsi="Wingdings" w:hint="default"/>
+      </w:rPr>
+    </w:lvl>
+    <w:lvl w:ilvl="6" w:tplc="04090001" w:tentative="1">
+      <w:start w:val="1"/>
+      <w:numFmt w:val="bullet"/>
+      <w:lvlText w:val=""/>
+      <w:lvlJc w:val="left"/>
+      <w:pPr>
+        <w:ind w:left="5040" w:hanging="360"/>
+      </w:pPr>
+      <w:rPr>
+        <w:rFonts w:ascii="Symbol" w:hAnsi="Symbol" w:hint="default"/>
+      </w:rPr>
+    </w:lvl>
+    <w:lvl w:ilvl="7" w:tplc="04090003" w:tentative="1">
+      <w:start w:val="1"/>
+      <w:numFmt w:val="bullet"/>
+      <w:lvlText w:val="o"/>
+      <w:lvlJc w:val="left"/>
+      <w:pPr>
+        <w:ind w:left="5760" w:hanging="360"/>
+      </w:pPr>
+      <w:rPr>
+        <w:rFonts w:ascii="Courier New" w:hAnsi="Courier New" w:cs="Courier New" w:hint="default"/>
+      </w:rPr>
+    </w:lvl>
+    <w:lvl w:ilvl="8" w:tplc="04090005" w:tentative="1">
+      <w:start w:val="1"/>
+      <w:numFmt w:val="bullet"/>
+      <w:lvlText w:val=""/>
+      <w:lvlJc w:val="left"/>
+      <w:pPr>
+        <w:ind w:left="6480" w:hanging="360"/>
+      </w:pPr>
+      <w:rPr>
+        <w:rFonts w:ascii="Wingdings" w:hAnsi="Wingdings" w:hint="default"/>
+      </w:rPr>
+    </w:lvl>
+  </w:abstractNum>
+  <w:abstractNum w:abstractNumId="9" w15:restartNumberingAfterBreak="0">
     <w:nsid w:val="6DD85287"/>
     <w:multiLevelType w:val="multilevel"/>
     <w:tmpl w:val="7D687DDE"/>
@@ -2895,7 +3039,7 @@
       </w:rPr>
     </w:lvl>
   </w:abstractNum>
-  <w:abstractNum w:abstractNumId="9" w15:restartNumberingAfterBreak="0">
+  <w:abstractNum w:abstractNumId="10" w15:restartNumberingAfterBreak="0">
     <w:nsid w:val="7B2C0946"/>
     <w:multiLevelType w:val="multilevel"/>
     <w:tmpl w:val="CBA4E7D2"/>
@@ -3054,7 +3198,7 @@
     <w:abstractNumId w:val="7"/>
   </w:num>
   <w:num w:numId="4" w16cid:durableId="1912547105">
-    <w:abstractNumId w:val="9"/>
+    <w:abstractNumId w:val="10"/>
   </w:num>
   <w:num w:numId="5" w16cid:durableId="437258782">
     <w:abstractNumId w:val="5"/>
@@ -3063,7 +3207,7 @@
     <w:abstractNumId w:val="1"/>
   </w:num>
   <w:num w:numId="7" w16cid:durableId="452679160">
-    <w:abstractNumId w:val="8"/>
+    <w:abstractNumId w:val="9"/>
   </w:num>
   <w:num w:numId="8" w16cid:durableId="121046154">
     <w:abstractNumId w:val="4"/>
@@ -3073,6 +3217,9 @@
   </w:num>
   <w:num w:numId="10" w16cid:durableId="1698121362">
     <w:abstractNumId w:val="2"/>
+  </w:num>
+  <w:num w:numId="11" w16cid:durableId="1378042109">
+    <w:abstractNumId w:val="8"/>
   </w:num>
 </w:numbering>
 </file>
@@ -3531,7 +3678,6 @@
     <w:next w:val="Normal"/>
     <w:link w:val="Heading3Char"/>
     <w:uiPriority w:val="9"/>
-    <w:semiHidden/>
     <w:unhideWhenUsed/>
     <w:qFormat/>
     <w:rsid w:val="00377258"/>
@@ -3554,7 +3700,6 @@
     <w:next w:val="Normal"/>
     <w:link w:val="Heading4Char"/>
     <w:uiPriority w:val="9"/>
-    <w:semiHidden/>
     <w:unhideWhenUsed/>
     <w:qFormat/>
     <w:rsid w:val="00377258"/>
@@ -3683,7 +3828,6 @@
   <w:style w:type="character" w:default="1" w:styleId="DefaultParagraphFont">
     <w:name w:val="Default Paragraph Font"/>
     <w:uiPriority w:val="1"/>
-    <w:semiHidden/>
     <w:unhideWhenUsed/>
   </w:style>
   <w:style w:type="table" w:default="1" w:styleId="TableNormal">
@@ -3738,7 +3882,6 @@
     <w:basedOn w:val="DefaultParagraphFont"/>
     <w:link w:val="Heading3"/>
     <w:uiPriority w:val="9"/>
-    <w:semiHidden/>
     <w:rsid w:val="00377258"/>
     <w:rPr>
       <w:rFonts w:eastAsiaTheme="majorEastAsia" w:cstheme="majorBidi"/>
@@ -3752,7 +3895,6 @@
     <w:basedOn w:val="DefaultParagraphFont"/>
     <w:link w:val="Heading4"/>
     <w:uiPriority w:val="9"/>
-    <w:semiHidden/>
     <w:rsid w:val="00377258"/>
     <w:rPr>
       <w:rFonts w:eastAsiaTheme="majorEastAsia" w:cstheme="majorBidi"/>
@@ -4039,7 +4181,6 @@
     <w:name w:val="Normal (Web)"/>
     <w:basedOn w:val="Normal"/>
     <w:uiPriority w:val="99"/>
-    <w:semiHidden/>
     <w:unhideWhenUsed/>
     <w:rsid w:val="00A86A3C"/>
     <w:pPr>
@@ -4062,6 +4203,29 @@
     <w:rPr>
       <w:b/>
       <w:bCs/>
+    </w:rPr>
+  </w:style>
+  <w:style w:type="character" w:styleId="Hyperlink">
+    <w:name w:val="Hyperlink"/>
+    <w:basedOn w:val="DefaultParagraphFont"/>
+    <w:uiPriority w:val="99"/>
+    <w:unhideWhenUsed/>
+    <w:rsid w:val="00C20E5D"/>
+    <w:rPr>
+      <w:color w:val="467886" w:themeColor="hyperlink"/>
+      <w:u w:val="single"/>
+    </w:rPr>
+  </w:style>
+  <w:style w:type="character" w:styleId="UnresolvedMention">
+    <w:name w:val="Unresolved Mention"/>
+    <w:basedOn w:val="DefaultParagraphFont"/>
+    <w:uiPriority w:val="99"/>
+    <w:semiHidden/>
+    <w:unhideWhenUsed/>
+    <w:rsid w:val="00C20E5D"/>
+    <w:rPr>
+      <w:color w:val="605E5C"/>
+      <w:shd w:val="clear" w:color="auto" w:fill="E1DFDD"/>
     </w:rPr>
   </w:style>
 </w:styles>

</xml_diff>